<commit_message>
Standardize phone numbers in tl_member, tl_user and tl_calendar_event_member
</commit_message>
<xml_diff>
--- a/contao/templates/docx/event_memberlist.docx
+++ b/contao/templates/docx/event_memberlist.docx
@@ -1,6 +1,6 @@
 
 <file path=word/document.xml><?xml version="1.0" encoding="utf-8"?>
-<w:document xmlns:wpc="http://schemas.microsoft.com/office/word/2010/wordprocessingCanvas" xmlns:cx="http://schemas.microsoft.com/office/drawing/2014/chartex" xmlns:cx1="http://schemas.microsoft.com/office/drawing/2015/9/8/chartex" xmlns:cx2="http://schemas.microsoft.com/office/drawing/2015/10/21/chartex" xmlns:cx3="http://schemas.microsoft.com/office/drawing/2016/5/9/chartex" xmlns:cx4="http://schemas.microsoft.com/office/drawing/2016/5/10/chartex" xmlns:cx5="http://schemas.microsoft.com/office/drawing/2016/5/11/chartex" xmlns:cx6="http://schemas.microsoft.com/office/drawing/2016/5/12/chartex" xmlns:cx7="http://schemas.microsoft.com/office/drawing/2016/5/13/chartex" xmlns:cx8="http://schemas.microsoft.com/office/drawing/2016/5/14/chartex" xmlns:mc="http://schemas.openxmlformats.org/markup-compatibility/2006" xmlns:aink="http://schemas.microsoft.com/office/drawing/2016/ink" xmlns:am3d="http://schemas.microsoft.com/office/drawing/2017/model3d" xmlns:o="urn:schemas-microsoft-com:office:office" xmlns:oel="http://schemas.microsoft.com/office/2019/extlst" xmlns:r="http://schemas.openxmlformats.org/officeDocument/2006/relationships" xmlns:m="http://schemas.openxmlformats.org/officeDocument/2006/math" xmlns:v="urn:schemas-microsoft-com:vml" xmlns:wp14="http://schemas.microsoft.com/office/word/2010/wordprocessingDrawing" xmlns:wp="http://schemas.openxmlformats.org/drawingml/2006/wordprocessingDrawing" xmlns:w10="urn:schemas-microsoft-com:office:word" xmlns:w="http://schemas.openxmlformats.org/wordprocessingml/2006/main" xmlns:w14="http://schemas.microsoft.com/office/word/2010/wordml" xmlns:w15="http://schemas.microsoft.com/office/word/2012/wordml" xmlns:w16cex="http://schemas.microsoft.com/office/word/2018/wordml/cex" xmlns:w16cid="http://schemas.microsoft.com/office/word/2016/wordml/cid" xmlns:w16="http://schemas.microsoft.com/office/word/2018/wordml" xmlns:w16sdtdh="http://schemas.microsoft.com/office/word/2020/wordml/sdtdatahash" xmlns:w16se="http://schemas.microsoft.com/office/word/2015/wordml/symex" xmlns:wpg="http://schemas.microsoft.com/office/word/2010/wordprocessingGroup" xmlns:wpi="http://schemas.microsoft.com/office/word/2010/wordprocessingInk" xmlns:wne="http://schemas.microsoft.com/office/word/2006/wordml" xmlns:wps="http://schemas.microsoft.com/office/word/2010/wordprocessingShape" mc:Ignorable="w14 w15 w16se w16cid w16 w16cex w16sdtdh wp14">
+<w:document xmlns:wpc="http://schemas.microsoft.com/office/word/2010/wordprocessingCanvas" xmlns:cx="http://schemas.microsoft.com/office/drawing/2014/chartex" xmlns:cx1="http://schemas.microsoft.com/office/drawing/2015/9/8/chartex" xmlns:cx2="http://schemas.microsoft.com/office/drawing/2015/10/21/chartex" xmlns:cx3="http://schemas.microsoft.com/office/drawing/2016/5/9/chartex" xmlns:cx4="http://schemas.microsoft.com/office/drawing/2016/5/10/chartex" xmlns:cx5="http://schemas.microsoft.com/office/drawing/2016/5/11/chartex" xmlns:cx6="http://schemas.microsoft.com/office/drawing/2016/5/12/chartex" xmlns:cx7="http://schemas.microsoft.com/office/drawing/2016/5/13/chartex" xmlns:cx8="http://schemas.microsoft.com/office/drawing/2016/5/14/chartex" xmlns:mc="http://schemas.openxmlformats.org/markup-compatibility/2006" xmlns:aink="http://schemas.microsoft.com/office/drawing/2016/ink" xmlns:am3d="http://schemas.microsoft.com/office/drawing/2017/model3d" xmlns:o="urn:schemas-microsoft-com:office:office" xmlns:oel="http://schemas.microsoft.com/office/2019/extlst" xmlns:r="http://schemas.openxmlformats.org/officeDocument/2006/relationships" xmlns:m="http://schemas.openxmlformats.org/officeDocument/2006/math" xmlns:v="urn:schemas-microsoft-com:vml" xmlns:wp14="http://schemas.microsoft.com/office/word/2010/wordprocessingDrawing" xmlns:wp="http://schemas.openxmlformats.org/drawingml/2006/wordprocessingDrawing" xmlns:w10="urn:schemas-microsoft-com:office:word" xmlns:w="http://schemas.openxmlformats.org/wordprocessingml/2006/main" xmlns:w14="http://schemas.microsoft.com/office/word/2010/wordml" xmlns:w15="http://schemas.microsoft.com/office/word/2012/wordml" xmlns:w16cex="http://schemas.microsoft.com/office/word/2018/wordml/cex" xmlns:w16cid="http://schemas.microsoft.com/office/word/2016/wordml/cid" xmlns:w16="http://schemas.microsoft.com/office/word/2018/wordml" xmlns:w16du="http://schemas.microsoft.com/office/word/2023/wordml/word16du" xmlns:w16sdtdh="http://schemas.microsoft.com/office/word/2020/wordml/sdtdatahash" xmlns:w16sdtfl="http://schemas.microsoft.com/office/word/2024/wordml/sdtformatlock" xmlns:w16se="http://schemas.microsoft.com/office/word/2015/wordml/symex" xmlns:wpg="http://schemas.microsoft.com/office/word/2010/wordprocessingGroup" xmlns:wpi="http://schemas.microsoft.com/office/word/2010/wordprocessingInk" xmlns:wne="http://schemas.microsoft.com/office/word/2006/wordml" xmlns:wps="http://schemas.microsoft.com/office/word/2010/wordprocessingShape" mc:Ignorable="w14 w15 w16se w16cid w16 w16cex w16sdtdh w16sdtfl w16du wp14">
   <w:body>
     <w:p>
       <w:pPr>
@@ -38,23 +38,7 @@
           <w:sz w:val="20"/>
           <w:szCs w:val="20"/>
         </w:rPr>
-        <w:t>${</w:t>
-      </w:r>
-      <w:proofErr w:type="spellStart"/>
-      <w:r>
-        <w:rPr>
-          <w:sz w:val="20"/>
-          <w:szCs w:val="20"/>
-        </w:rPr>
-        <w:t>courseId</w:t>
-      </w:r>
-      <w:proofErr w:type="spellEnd"/>
-      <w:r>
-        <w:rPr>
-          <w:sz w:val="20"/>
-          <w:szCs w:val="20"/>
-        </w:rPr>
-        <w:t>}</w:t>
+        <w:t>${courseId}</w:t>
       </w:r>
     </w:p>
     <w:tbl>
@@ -128,23 +112,7 @@
                 <w:sz w:val="20"/>
                 <w:szCs w:val="20"/>
               </w:rPr>
-              <w:t>${</w:t>
-            </w:r>
-            <w:proofErr w:type="spellStart"/>
-            <w:r>
-              <w:rPr>
-                <w:sz w:val="20"/>
-                <w:szCs w:val="20"/>
-              </w:rPr>
-              <w:t>eventInstructors</w:t>
-            </w:r>
-            <w:proofErr w:type="spellEnd"/>
-            <w:r>
-              <w:rPr>
-                <w:sz w:val="20"/>
-                <w:szCs w:val="20"/>
-              </w:rPr>
-              <w:t>}</w:t>
+              <w:t>${eventInstructors}</w:t>
             </w:r>
           </w:p>
         </w:tc>
@@ -190,23 +158,7 @@
                 <w:sz w:val="20"/>
                 <w:szCs w:val="20"/>
               </w:rPr>
-              <w:t>${</w:t>
-            </w:r>
-            <w:proofErr w:type="spellStart"/>
-            <w:r>
-              <w:rPr>
-                <w:sz w:val="20"/>
-                <w:szCs w:val="20"/>
-              </w:rPr>
-              <w:t>eventTechDifficulties</w:t>
-            </w:r>
-            <w:proofErr w:type="spellEnd"/>
-            <w:r>
-              <w:rPr>
-                <w:sz w:val="20"/>
-                <w:szCs w:val="20"/>
-              </w:rPr>
-              <w:t>}</w:t>
+              <w:t>${eventTechDifficulties}</w:t>
             </w:r>
           </w:p>
         </w:tc>
@@ -307,23 +259,7 @@
                 <w:sz w:val="20"/>
                 <w:szCs w:val="20"/>
               </w:rPr>
-              <w:t>${</w:t>
-            </w:r>
-            <w:proofErr w:type="spellStart"/>
-            <w:r>
-              <w:rPr>
-                <w:sz w:val="20"/>
-                <w:szCs w:val="20"/>
-              </w:rPr>
-              <w:t>eventTitle</w:t>
-            </w:r>
-            <w:proofErr w:type="spellEnd"/>
-            <w:r>
-              <w:rPr>
-                <w:sz w:val="20"/>
-                <w:szCs w:val="20"/>
-              </w:rPr>
-              <w:t>}</w:t>
+              <w:t>${eventTitle}</w:t>
             </w:r>
           </w:p>
         </w:tc>
@@ -371,23 +307,7 @@
                 <w:sz w:val="20"/>
                 <w:szCs w:val="20"/>
               </w:rPr>
-              <w:t>${</w:t>
-            </w:r>
-            <w:proofErr w:type="spellStart"/>
-            <w:r>
-              <w:rPr>
-                <w:sz w:val="20"/>
-                <w:szCs w:val="20"/>
-              </w:rPr>
-              <w:t>eventTourProfile</w:t>
-            </w:r>
-            <w:proofErr w:type="spellEnd"/>
-            <w:r>
-              <w:rPr>
-                <w:sz w:val="20"/>
-                <w:szCs w:val="20"/>
-              </w:rPr>
-              <w:t>}</w:t>
+              <w:t>${eventTourProfile}</w:t>
             </w:r>
           </w:p>
         </w:tc>
@@ -480,23 +400,7 @@
                 <w:sz w:val="20"/>
                 <w:szCs w:val="20"/>
               </w:rPr>
-              <w:t>${</w:t>
-            </w:r>
-            <w:proofErr w:type="spellStart"/>
-            <w:r>
-              <w:rPr>
-                <w:sz w:val="20"/>
-                <w:szCs w:val="20"/>
-              </w:rPr>
-              <w:t>eventDates</w:t>
-            </w:r>
-            <w:proofErr w:type="spellEnd"/>
-            <w:r>
-              <w:rPr>
-                <w:sz w:val="20"/>
-                <w:szCs w:val="20"/>
-              </w:rPr>
-              <w:t>}</w:t>
+              <w:t>${eventDates}</w:t>
             </w:r>
           </w:p>
         </w:tc>
@@ -575,23 +479,7 @@
                 <w:sz w:val="20"/>
                 <w:szCs w:val="20"/>
               </w:rPr>
-              <w:t>${</w:t>
-            </w:r>
-            <w:proofErr w:type="spellStart"/>
-            <w:r>
-              <w:rPr>
-                <w:sz w:val="20"/>
-                <w:szCs w:val="20"/>
-              </w:rPr>
-              <w:t>eventMiscellaneous</w:t>
-            </w:r>
-            <w:proofErr w:type="spellEnd"/>
-            <w:r>
-              <w:rPr>
-                <w:sz w:val="20"/>
-                <w:szCs w:val="20"/>
-              </w:rPr>
-              <w:t>}</w:t>
+              <w:t>${eventMiscellaneous}</w:t>
             </w:r>
           </w:p>
         </w:tc>
@@ -640,7 +528,6 @@
               </w:rPr>
               <w:t>${</w:t>
             </w:r>
-            <w:proofErr w:type="spellStart"/>
             <w:r>
               <w:rPr>
                 <w:sz w:val="20"/>
@@ -653,15 +540,7 @@
                 <w:sz w:val="20"/>
                 <w:szCs w:val="20"/>
               </w:rPr>
-              <w:t>eetingpoint</w:t>
-            </w:r>
-            <w:proofErr w:type="spellEnd"/>
-            <w:r>
-              <w:rPr>
-                <w:sz w:val="20"/>
-                <w:szCs w:val="20"/>
-              </w:rPr>
-              <w:t>}</w:t>
+              <w:t>eetingpoint}</w:t>
             </w:r>
           </w:p>
         </w:tc>
@@ -739,23 +618,7 @@
                 <w:sz w:val="20"/>
                 <w:szCs w:val="20"/>
               </w:rPr>
-              <w:t>${</w:t>
-            </w:r>
-            <w:proofErr w:type="spellStart"/>
-            <w:r>
-              <w:rPr>
-                <w:sz w:val="20"/>
-                <w:szCs w:val="20"/>
-              </w:rPr>
-              <w:t>eventEquipment</w:t>
-            </w:r>
-            <w:proofErr w:type="spellEnd"/>
-            <w:r>
-              <w:rPr>
-                <w:sz w:val="20"/>
-                <w:szCs w:val="20"/>
-              </w:rPr>
-              <w:t>}</w:t>
+              <w:t>${eventEquipment}</w:t>
             </w:r>
           </w:p>
         </w:tc>
@@ -858,51 +721,15 @@
                 <w:sz w:val="20"/>
                 <w:szCs w:val="20"/>
               </w:rPr>
-              <w:t xml:space="preserve"> </w:t>
-            </w:r>
-            <w:proofErr w:type="spellStart"/>
-            <w:r>
-              <w:rPr>
-                <w:b/>
-                <w:sz w:val="20"/>
-                <w:szCs w:val="20"/>
-              </w:rPr>
-              <w:t>Mitgl</w:t>
-            </w:r>
-            <w:proofErr w:type="spellEnd"/>
-            <w:r>
-              <w:rPr>
-                <w:b/>
-                <w:sz w:val="20"/>
-                <w:szCs w:val="20"/>
-              </w:rPr>
-              <w:t xml:space="preserve">. </w:t>
-            </w:r>
-            <w:proofErr w:type="spellStart"/>
-            <w:r>
-              <w:rPr>
-                <w:b/>
-                <w:sz w:val="20"/>
-                <w:szCs w:val="20"/>
-              </w:rPr>
-              <w:t>N</w:t>
-            </w:r>
-            <w:r>
-              <w:rPr>
-                <w:b/>
-                <w:sz w:val="20"/>
-                <w:szCs w:val="20"/>
-              </w:rPr>
-              <w:t>o</w:t>
-            </w:r>
-            <w:proofErr w:type="spellEnd"/>
-            <w:r>
-              <w:rPr>
-                <w:b/>
-                <w:sz w:val="20"/>
-                <w:szCs w:val="20"/>
-              </w:rPr>
-              <w:t>.</w:t>
+              <w:t xml:space="preserve"> Mitgl. N</w:t>
+            </w:r>
+            <w:r>
+              <w:rPr>
+                <w:b/>
+                <w:sz w:val="20"/>
+                <w:szCs w:val="20"/>
+              </w:rPr>
+              <w:t>o.</w:t>
             </w:r>
             <w:r>
               <w:rPr>
@@ -1030,7 +857,6 @@
               </w:rPr>
               <w:t>${</w:t>
             </w:r>
-            <w:proofErr w:type="spellStart"/>
             <w:r>
               <w:rPr>
                 <w:sz w:val="20"/>
@@ -1038,7 +864,6 @@
               </w:rPr>
               <w:t>role</w:t>
             </w:r>
-            <w:proofErr w:type="spellEnd"/>
             <w:r>
               <w:rPr>
                 <w:sz w:val="20"/>
@@ -1066,17 +891,192 @@
                 <w:sz w:val="20"/>
                 <w:szCs w:val="20"/>
               </w:rPr>
+              <w:t>${lastname}</w:t>
+            </w:r>
+            <w:r>
+              <w:rPr>
+                <w:sz w:val="20"/>
+                <w:szCs w:val="20"/>
+              </w:rPr>
+              <w:t xml:space="preserve"> </w:t>
+            </w:r>
+            <w:r>
+              <w:rPr>
+                <w:sz w:val="20"/>
+                <w:szCs w:val="20"/>
+              </w:rPr>
+              <w:t>${firstname}</w:t>
+            </w:r>
+            <w:r>
+              <w:rPr>
+                <w:sz w:val="20"/>
+                <w:szCs w:val="20"/>
+              </w:rPr>
+              <w:br/>
+              <w:t>${sacMemberId}</w:t>
+            </w:r>
+            <w:r>
+              <w:rPr>
+                <w:sz w:val="20"/>
+                <w:szCs w:val="20"/>
+              </w:rPr>
+              <w:t xml:space="preserve"> </w:t>
+            </w:r>
+            <w:r>
+              <w:rPr>
+                <w:sz w:val="20"/>
+                <w:szCs w:val="20"/>
+              </w:rPr>
+              <w:t xml:space="preserve">${memberInSection} </w:t>
+            </w:r>
+            <w:r>
+              <w:rPr>
+                <w:b/>
+                <w:color w:val="FF0000"/>
+                <w:sz w:val="20"/>
+                <w:szCs w:val="20"/>
+              </w:rPr>
               <w:t>${</w:t>
             </w:r>
-            <w:proofErr w:type="spellStart"/>
-            <w:r>
-              <w:rPr>
-                <w:sz w:val="20"/>
-                <w:szCs w:val="20"/>
-              </w:rPr>
-              <w:t>lastname</w:t>
-            </w:r>
-            <w:proofErr w:type="spellEnd"/>
+            <w:r>
+              <w:rPr>
+                <w:b/>
+                <w:color w:val="FF0000"/>
+                <w:sz w:val="20"/>
+                <w:szCs w:val="20"/>
+              </w:rPr>
+              <w:t>is</w:t>
+            </w:r>
+            <w:r>
+              <w:rPr>
+                <w:b/>
+                <w:color w:val="FF0000"/>
+                <w:sz w:val="20"/>
+                <w:szCs w:val="20"/>
+              </w:rPr>
+              <w:t>Not</w:t>
+            </w:r>
+            <w:r>
+              <w:rPr>
+                <w:b/>
+                <w:color w:val="FF0000"/>
+                <w:sz w:val="20"/>
+                <w:szCs w:val="20"/>
+              </w:rPr>
+              <w:t>Sac</w:t>
+            </w:r>
+            <w:r>
+              <w:rPr>
+                <w:b/>
+                <w:color w:val="FF0000"/>
+                <w:sz w:val="20"/>
+                <w:szCs w:val="20"/>
+              </w:rPr>
+              <w:t>Member}</w:t>
+            </w:r>
+            <w:r>
+              <w:rPr>
+                <w:b/>
+                <w:color w:val="FF0000"/>
+                <w:sz w:val="20"/>
+                <w:szCs w:val="20"/>
+              </w:rPr>
+              <w:br/>
+            </w:r>
+            <w:r>
+              <w:rPr>
+                <w:sz w:val="20"/>
+                <w:szCs w:val="20"/>
+              </w:rPr>
+              <w:t>${email}</w:t>
+            </w:r>
+            <w:r>
+              <w:rPr>
+                <w:sz w:val="20"/>
+                <w:szCs w:val="20"/>
+              </w:rPr>
+              <w:t xml:space="preserve"> </w:t>
+            </w:r>
+            <w:r>
+              <w:rPr>
+                <w:color w:val="00B050"/>
+                <w:sz w:val="20"/>
+                <w:szCs w:val="20"/>
+              </w:rPr>
+              <w:t>${</w:t>
+            </w:r>
+            <w:r>
+              <w:rPr>
+                <w:color w:val="00B050"/>
+                <w:sz w:val="20"/>
+                <w:szCs w:val="20"/>
+              </w:rPr>
+              <w:t>transportInfo}</w:t>
+            </w:r>
+          </w:p>
+        </w:tc>
+        <w:tc>
+          <w:tcPr>
+            <w:tcW w:w="2693" w:type="dxa"/>
+            <w:shd w:val="clear" w:color="auto" w:fill="auto"/>
+          </w:tcPr>
+          <w:p>
+            <w:pPr>
+              <w:rPr>
+                <w:sz w:val="20"/>
+                <w:szCs w:val="20"/>
+              </w:rPr>
+            </w:pPr>
+            <w:r>
+              <w:rPr>
+                <w:sz w:val="20"/>
+                <w:szCs w:val="20"/>
+              </w:rPr>
+              <w:t>${street}</w:t>
+            </w:r>
+            <w:r>
+              <w:rPr>
+                <w:sz w:val="20"/>
+                <w:szCs w:val="20"/>
+              </w:rPr>
+              <w:br/>
+              <w:t>${postal} ${city}</w:t>
+            </w:r>
+            <w:r>
+              <w:rPr>
+                <w:sz w:val="20"/>
+                <w:szCs w:val="20"/>
+              </w:rPr>
+              <w:br/>
+            </w:r>
+          </w:p>
+        </w:tc>
+        <w:tc>
+          <w:tcPr>
+            <w:tcW w:w="4252" w:type="dxa"/>
+            <w:shd w:val="clear" w:color="auto" w:fill="auto"/>
+          </w:tcPr>
+          <w:p>
+            <w:pPr>
+              <w:rPr>
+                <w:sz w:val="20"/>
+                <w:szCs w:val="20"/>
+              </w:rPr>
+            </w:pPr>
+            <w:r>
+              <w:rPr>
+                <w:sz w:val="20"/>
+                <w:szCs w:val="20"/>
+              </w:rPr>
+              <w:t>${</w:t>
+            </w:r>
+            <w:r>
+              <w:rPr>
+                <w:sz w:val="20"/>
+                <w:szCs w:val="20"/>
+              </w:rPr>
+              <w:t>phone</w:t>
+            </w:r>
             <w:r>
               <w:rPr>
                 <w:sz w:val="20"/>
@@ -1089,7 +1089,14 @@
                 <w:sz w:val="20"/>
                 <w:szCs w:val="20"/>
               </w:rPr>
-              <w:t xml:space="preserve"> </w:t>
+              <w:br/>
+            </w:r>
+            <w:r>
+              <w:rPr>
+                <w:sz w:val="20"/>
+                <w:szCs w:val="20"/>
+              </w:rPr>
+              <w:t xml:space="preserve">Im Notfall: </w:t>
             </w:r>
             <w:r>
               <w:rPr>
@@ -1098,292 +1105,6 @@
               </w:rPr>
               <w:t>${</w:t>
             </w:r>
-            <w:proofErr w:type="spellStart"/>
-            <w:r>
-              <w:rPr>
-                <w:sz w:val="20"/>
-                <w:szCs w:val="20"/>
-              </w:rPr>
-              <w:t>firstname</w:t>
-            </w:r>
-            <w:proofErr w:type="spellEnd"/>
-            <w:r>
-              <w:rPr>
-                <w:sz w:val="20"/>
-                <w:szCs w:val="20"/>
-              </w:rPr>
-              <w:t>}</w:t>
-            </w:r>
-            <w:r>
-              <w:rPr>
-                <w:sz w:val="20"/>
-                <w:szCs w:val="20"/>
-              </w:rPr>
-              <w:br/>
-              <w:t>${</w:t>
-            </w:r>
-            <w:proofErr w:type="spellStart"/>
-            <w:r>
-              <w:rPr>
-                <w:sz w:val="20"/>
-                <w:szCs w:val="20"/>
-              </w:rPr>
-              <w:t>sacMemberId</w:t>
-            </w:r>
-            <w:proofErr w:type="spellEnd"/>
-            <w:r>
-              <w:rPr>
-                <w:sz w:val="20"/>
-                <w:szCs w:val="20"/>
-              </w:rPr>
-              <w:t>}</w:t>
-            </w:r>
-            <w:r>
-              <w:rPr>
-                <w:sz w:val="20"/>
-                <w:szCs w:val="20"/>
-              </w:rPr>
-              <w:t xml:space="preserve"> </w:t>
-            </w:r>
-            <w:r>
-              <w:rPr>
-                <w:sz w:val="20"/>
-                <w:szCs w:val="20"/>
-              </w:rPr>
-              <w:t>${</w:t>
-            </w:r>
-            <w:proofErr w:type="spellStart"/>
-            <w:r>
-              <w:rPr>
-                <w:sz w:val="20"/>
-                <w:szCs w:val="20"/>
-              </w:rPr>
-              <w:t>memberInSection</w:t>
-            </w:r>
-            <w:proofErr w:type="spellEnd"/>
-            <w:r>
-              <w:rPr>
-                <w:sz w:val="20"/>
-                <w:szCs w:val="20"/>
-              </w:rPr>
-              <w:t xml:space="preserve">} </w:t>
-            </w:r>
-            <w:r>
-              <w:rPr>
-                <w:b/>
-                <w:color w:val="FF0000"/>
-                <w:sz w:val="20"/>
-                <w:szCs w:val="20"/>
-              </w:rPr>
-              <w:t>${</w:t>
-            </w:r>
-            <w:proofErr w:type="spellStart"/>
-            <w:r>
-              <w:rPr>
-                <w:b/>
-                <w:color w:val="FF0000"/>
-                <w:sz w:val="20"/>
-                <w:szCs w:val="20"/>
-              </w:rPr>
-              <w:t>is</w:t>
-            </w:r>
-            <w:r>
-              <w:rPr>
-                <w:b/>
-                <w:color w:val="FF0000"/>
-                <w:sz w:val="20"/>
-                <w:szCs w:val="20"/>
-              </w:rPr>
-              <w:t>Not</w:t>
-            </w:r>
-            <w:r>
-              <w:rPr>
-                <w:b/>
-                <w:color w:val="FF0000"/>
-                <w:sz w:val="20"/>
-                <w:szCs w:val="20"/>
-              </w:rPr>
-              <w:t>Sac</w:t>
-            </w:r>
-            <w:r>
-              <w:rPr>
-                <w:b/>
-                <w:color w:val="FF0000"/>
-                <w:sz w:val="20"/>
-                <w:szCs w:val="20"/>
-              </w:rPr>
-              <w:t>Member</w:t>
-            </w:r>
-            <w:proofErr w:type="spellEnd"/>
-            <w:r>
-              <w:rPr>
-                <w:b/>
-                <w:color w:val="FF0000"/>
-                <w:sz w:val="20"/>
-                <w:szCs w:val="20"/>
-              </w:rPr>
-              <w:t>}</w:t>
-            </w:r>
-            <w:r>
-              <w:rPr>
-                <w:b/>
-                <w:color w:val="FF0000"/>
-                <w:sz w:val="20"/>
-                <w:szCs w:val="20"/>
-              </w:rPr>
-              <w:br/>
-            </w:r>
-            <w:r>
-              <w:rPr>
-                <w:sz w:val="20"/>
-                <w:szCs w:val="20"/>
-              </w:rPr>
-              <w:t>${email}</w:t>
-            </w:r>
-            <w:r>
-              <w:rPr>
-                <w:sz w:val="20"/>
-                <w:szCs w:val="20"/>
-              </w:rPr>
-              <w:t xml:space="preserve"> </w:t>
-            </w:r>
-            <w:r>
-              <w:rPr>
-                <w:color w:val="00B050"/>
-                <w:sz w:val="20"/>
-                <w:szCs w:val="20"/>
-              </w:rPr>
-              <w:t>${</w:t>
-            </w:r>
-            <w:proofErr w:type="spellStart"/>
-            <w:r>
-              <w:rPr>
-                <w:color w:val="00B050"/>
-                <w:sz w:val="20"/>
-                <w:szCs w:val="20"/>
-              </w:rPr>
-              <w:t>transportInfo</w:t>
-            </w:r>
-            <w:proofErr w:type="spellEnd"/>
-            <w:r>
-              <w:rPr>
-                <w:color w:val="00B050"/>
-                <w:sz w:val="20"/>
-                <w:szCs w:val="20"/>
-              </w:rPr>
-              <w:t>}</w:t>
-            </w:r>
-          </w:p>
-        </w:tc>
-        <w:tc>
-          <w:tcPr>
-            <w:tcW w:w="2693" w:type="dxa"/>
-            <w:shd w:val="clear" w:color="auto" w:fill="auto"/>
-          </w:tcPr>
-          <w:p>
-            <w:pPr>
-              <w:rPr>
-                <w:sz w:val="20"/>
-                <w:szCs w:val="20"/>
-              </w:rPr>
-            </w:pPr>
-            <w:r>
-              <w:rPr>
-                <w:sz w:val="20"/>
-                <w:szCs w:val="20"/>
-              </w:rPr>
-              <w:t>${</w:t>
-            </w:r>
-            <w:proofErr w:type="spellStart"/>
-            <w:r>
-              <w:rPr>
-                <w:sz w:val="20"/>
-                <w:szCs w:val="20"/>
-              </w:rPr>
-              <w:t>street</w:t>
-            </w:r>
-            <w:proofErr w:type="spellEnd"/>
-            <w:r>
-              <w:rPr>
-                <w:sz w:val="20"/>
-                <w:szCs w:val="20"/>
-              </w:rPr>
-              <w:t>}</w:t>
-            </w:r>
-            <w:r>
-              <w:rPr>
-                <w:sz w:val="20"/>
-                <w:szCs w:val="20"/>
-              </w:rPr>
-              <w:br/>
-              <w:t>${postal} ${</w:t>
-            </w:r>
-            <w:proofErr w:type="spellStart"/>
-            <w:r>
-              <w:rPr>
-                <w:sz w:val="20"/>
-                <w:szCs w:val="20"/>
-              </w:rPr>
-              <w:t>city</w:t>
-            </w:r>
-            <w:proofErr w:type="spellEnd"/>
-            <w:r>
-              <w:rPr>
-                <w:sz w:val="20"/>
-                <w:szCs w:val="20"/>
-              </w:rPr>
-              <w:t>}</w:t>
-            </w:r>
-            <w:r>
-              <w:rPr>
-                <w:sz w:val="20"/>
-                <w:szCs w:val="20"/>
-              </w:rPr>
-              <w:br/>
-            </w:r>
-          </w:p>
-        </w:tc>
-        <w:tc>
-          <w:tcPr>
-            <w:tcW w:w="4252" w:type="dxa"/>
-            <w:shd w:val="clear" w:color="auto" w:fill="auto"/>
-          </w:tcPr>
-          <w:p>
-            <w:pPr>
-              <w:rPr>
-                <w:sz w:val="20"/>
-                <w:szCs w:val="20"/>
-              </w:rPr>
-            </w:pPr>
-            <w:r>
-              <w:rPr>
-                <w:sz w:val="20"/>
-                <w:szCs w:val="20"/>
-              </w:rPr>
-              <w:t>Tel: ${mobile}</w:t>
-            </w:r>
-            <w:r>
-              <w:rPr>
-                <w:sz w:val="20"/>
-                <w:szCs w:val="20"/>
-              </w:rPr>
-              <w:br/>
-            </w:r>
-            <w:r>
-              <w:rPr>
-                <w:sz w:val="20"/>
-                <w:szCs w:val="20"/>
-              </w:rPr>
-              <w:t xml:space="preserve">Im Notfall: </w:t>
-            </w:r>
-            <w:r>
-              <w:rPr>
-                <w:sz w:val="20"/>
-                <w:szCs w:val="20"/>
-              </w:rPr>
-              <w:t>${</w:t>
-            </w:r>
-            <w:proofErr w:type="spellStart"/>
             <w:r>
               <w:rPr>
                 <w:sz w:val="20"/>
@@ -1391,7 +1112,6 @@
               </w:rPr>
               <w:t>emergencyPhoneName</w:t>
             </w:r>
-            <w:proofErr w:type="spellEnd"/>
             <w:r>
               <w:rPr>
                 <w:sz w:val="20"/>
@@ -1414,7 +1134,6 @@
               </w:rPr>
               <w:t>${</w:t>
             </w:r>
-            <w:proofErr w:type="spellStart"/>
             <w:r>
               <w:rPr>
                 <w:sz w:val="20"/>
@@ -1422,7 +1141,6 @@
               </w:rPr>
               <w:t>emergencyPhone</w:t>
             </w:r>
-            <w:proofErr w:type="spellEnd"/>
             <w:r>
               <w:rPr>
                 <w:sz w:val="20"/>
@@ -1521,23 +1239,7 @@
                 <w:sz w:val="20"/>
                 <w:szCs w:val="20"/>
               </w:rPr>
-              <w:t>${</w:t>
-            </w:r>
-            <w:proofErr w:type="spellStart"/>
-            <w:r>
-              <w:rPr>
-                <w:sz w:val="20"/>
-                <w:szCs w:val="20"/>
-              </w:rPr>
-              <w:t>emergencyConcept</w:t>
-            </w:r>
-            <w:proofErr w:type="spellEnd"/>
-            <w:r>
-              <w:rPr>
-                <w:sz w:val="20"/>
-                <w:szCs w:val="20"/>
-              </w:rPr>
-              <w:t>}</w:t>
+              <w:t>${emergencyConcept}</w:t>
             </w:r>
           </w:p>
         </w:tc>
@@ -1562,15 +1264,7 @@
           <w:sz w:val="20"/>
           <w:szCs w:val="20"/>
         </w:rPr>
-        <w:t>${</w:t>
-      </w:r>
-      <w:proofErr w:type="spellStart"/>
-      <w:r>
-        <w:rPr>
-          <w:sz w:val="20"/>
-          <w:szCs w:val="20"/>
-        </w:rPr>
-        <w:t>event</w:t>
+        <w:t>${event</w:t>
       </w:r>
       <w:r>
         <w:rPr>
@@ -1579,7 +1273,6 @@
         </w:rPr>
         <w:t>Id</w:t>
       </w:r>
-      <w:proofErr w:type="spellEnd"/>
       <w:r>
         <w:rPr>
           <w:sz w:val="20"/>
@@ -1605,7 +1298,7 @@
 </file>
 
 <file path=word/endnotes.xml><?xml version="1.0" encoding="utf-8"?>
-<w:endnotes xmlns:wpc="http://schemas.microsoft.com/office/word/2010/wordprocessingCanvas" xmlns:cx="http://schemas.microsoft.com/office/drawing/2014/chartex" xmlns:cx1="http://schemas.microsoft.com/office/drawing/2015/9/8/chartex" xmlns:cx2="http://schemas.microsoft.com/office/drawing/2015/10/21/chartex" xmlns:cx3="http://schemas.microsoft.com/office/drawing/2016/5/9/chartex" xmlns:cx4="http://schemas.microsoft.com/office/drawing/2016/5/10/chartex" xmlns:cx5="http://schemas.microsoft.com/office/drawing/2016/5/11/chartex" xmlns:cx6="http://schemas.microsoft.com/office/drawing/2016/5/12/chartex" xmlns:cx7="http://schemas.microsoft.com/office/drawing/2016/5/13/chartex" xmlns:cx8="http://schemas.microsoft.com/office/drawing/2016/5/14/chartex" xmlns:mc="http://schemas.openxmlformats.org/markup-compatibility/2006" xmlns:aink="http://schemas.microsoft.com/office/drawing/2016/ink" xmlns:am3d="http://schemas.microsoft.com/office/drawing/2017/model3d" xmlns:o="urn:schemas-microsoft-com:office:office" xmlns:oel="http://schemas.microsoft.com/office/2019/extlst" xmlns:r="http://schemas.openxmlformats.org/officeDocument/2006/relationships" xmlns:m="http://schemas.openxmlformats.org/officeDocument/2006/math" xmlns:v="urn:schemas-microsoft-com:vml" xmlns:wp14="http://schemas.microsoft.com/office/word/2010/wordprocessingDrawing" xmlns:wp="http://schemas.openxmlformats.org/drawingml/2006/wordprocessingDrawing" xmlns:w10="urn:schemas-microsoft-com:office:word" xmlns:w="http://schemas.openxmlformats.org/wordprocessingml/2006/main" xmlns:w14="http://schemas.microsoft.com/office/word/2010/wordml" xmlns:w15="http://schemas.microsoft.com/office/word/2012/wordml" xmlns:w16cex="http://schemas.microsoft.com/office/word/2018/wordml/cex" xmlns:w16cid="http://schemas.microsoft.com/office/word/2016/wordml/cid" xmlns:w16="http://schemas.microsoft.com/office/word/2018/wordml" xmlns:w16sdtdh="http://schemas.microsoft.com/office/word/2020/wordml/sdtdatahash" xmlns:w16se="http://schemas.microsoft.com/office/word/2015/wordml/symex" xmlns:wpg="http://schemas.microsoft.com/office/word/2010/wordprocessingGroup" xmlns:wpi="http://schemas.microsoft.com/office/word/2010/wordprocessingInk" xmlns:wne="http://schemas.microsoft.com/office/word/2006/wordml" xmlns:wps="http://schemas.microsoft.com/office/word/2010/wordprocessingShape" mc:Ignorable="w14 w15 w16se w16cid w16 w16cex w16sdtdh wp14">
+<w:endnotes xmlns:wpc="http://schemas.microsoft.com/office/word/2010/wordprocessingCanvas" xmlns:cx="http://schemas.microsoft.com/office/drawing/2014/chartex" xmlns:cx1="http://schemas.microsoft.com/office/drawing/2015/9/8/chartex" xmlns:cx2="http://schemas.microsoft.com/office/drawing/2015/10/21/chartex" xmlns:cx3="http://schemas.microsoft.com/office/drawing/2016/5/9/chartex" xmlns:cx4="http://schemas.microsoft.com/office/drawing/2016/5/10/chartex" xmlns:cx5="http://schemas.microsoft.com/office/drawing/2016/5/11/chartex" xmlns:cx6="http://schemas.microsoft.com/office/drawing/2016/5/12/chartex" xmlns:cx7="http://schemas.microsoft.com/office/drawing/2016/5/13/chartex" xmlns:cx8="http://schemas.microsoft.com/office/drawing/2016/5/14/chartex" xmlns:mc="http://schemas.openxmlformats.org/markup-compatibility/2006" xmlns:aink="http://schemas.microsoft.com/office/drawing/2016/ink" xmlns:am3d="http://schemas.microsoft.com/office/drawing/2017/model3d" xmlns:o="urn:schemas-microsoft-com:office:office" xmlns:oel="http://schemas.microsoft.com/office/2019/extlst" xmlns:r="http://schemas.openxmlformats.org/officeDocument/2006/relationships" xmlns:m="http://schemas.openxmlformats.org/officeDocument/2006/math" xmlns:v="urn:schemas-microsoft-com:vml" xmlns:wp14="http://schemas.microsoft.com/office/word/2010/wordprocessingDrawing" xmlns:wp="http://schemas.openxmlformats.org/drawingml/2006/wordprocessingDrawing" xmlns:w10="urn:schemas-microsoft-com:office:word" xmlns:w="http://schemas.openxmlformats.org/wordprocessingml/2006/main" xmlns:w14="http://schemas.microsoft.com/office/word/2010/wordml" xmlns:w15="http://schemas.microsoft.com/office/word/2012/wordml" xmlns:w16cex="http://schemas.microsoft.com/office/word/2018/wordml/cex" xmlns:w16cid="http://schemas.microsoft.com/office/word/2016/wordml/cid" xmlns:w16="http://schemas.microsoft.com/office/word/2018/wordml" xmlns:w16du="http://schemas.microsoft.com/office/word/2023/wordml/word16du" xmlns:w16sdtdh="http://schemas.microsoft.com/office/word/2020/wordml/sdtdatahash" xmlns:w16sdtfl="http://schemas.microsoft.com/office/word/2024/wordml/sdtformatlock" xmlns:w16se="http://schemas.microsoft.com/office/word/2015/wordml/symex" xmlns:wpg="http://schemas.microsoft.com/office/word/2010/wordprocessingGroup" xmlns:wpi="http://schemas.microsoft.com/office/word/2010/wordprocessingInk" xmlns:wne="http://schemas.microsoft.com/office/word/2006/wordml" xmlns:wps="http://schemas.microsoft.com/office/word/2010/wordprocessingShape" mc:Ignorable="w14 w15 w16se w16cid w16 w16cex w16sdtdh w16sdtfl w16du wp14">
   <w:endnote w:type="separator" w:id="-1">
     <w:p>
       <w:pPr>
@@ -1630,7 +1323,7 @@
 </file>
 
 <file path=word/footer1.xml><?xml version="1.0" encoding="utf-8"?>
-<w:ftr xmlns:wpc="http://schemas.microsoft.com/office/word/2010/wordprocessingCanvas" xmlns:cx="http://schemas.microsoft.com/office/drawing/2014/chartex" xmlns:cx1="http://schemas.microsoft.com/office/drawing/2015/9/8/chartex" xmlns:cx2="http://schemas.microsoft.com/office/drawing/2015/10/21/chartex" xmlns:cx3="http://schemas.microsoft.com/office/drawing/2016/5/9/chartex" xmlns:cx4="http://schemas.microsoft.com/office/drawing/2016/5/10/chartex" xmlns:cx5="http://schemas.microsoft.com/office/drawing/2016/5/11/chartex" xmlns:cx6="http://schemas.microsoft.com/office/drawing/2016/5/12/chartex" xmlns:cx7="http://schemas.microsoft.com/office/drawing/2016/5/13/chartex" xmlns:cx8="http://schemas.microsoft.com/office/drawing/2016/5/14/chartex" xmlns:mc="http://schemas.openxmlformats.org/markup-compatibility/2006" xmlns:aink="http://schemas.microsoft.com/office/drawing/2016/ink" xmlns:am3d="http://schemas.microsoft.com/office/drawing/2017/model3d" xmlns:o="urn:schemas-microsoft-com:office:office" xmlns:oel="http://schemas.microsoft.com/office/2019/extlst" xmlns:r="http://schemas.openxmlformats.org/officeDocument/2006/relationships" xmlns:m="http://schemas.openxmlformats.org/officeDocument/2006/math" xmlns:v="urn:schemas-microsoft-com:vml" xmlns:wp14="http://schemas.microsoft.com/office/word/2010/wordprocessingDrawing" xmlns:wp="http://schemas.openxmlformats.org/drawingml/2006/wordprocessingDrawing" xmlns:w10="urn:schemas-microsoft-com:office:word" xmlns:w="http://schemas.openxmlformats.org/wordprocessingml/2006/main" xmlns:w14="http://schemas.microsoft.com/office/word/2010/wordml" xmlns:w15="http://schemas.microsoft.com/office/word/2012/wordml" xmlns:w16cex="http://schemas.microsoft.com/office/word/2018/wordml/cex" xmlns:w16cid="http://schemas.microsoft.com/office/word/2016/wordml/cid" xmlns:w16="http://schemas.microsoft.com/office/word/2018/wordml" xmlns:w16sdtdh="http://schemas.microsoft.com/office/word/2020/wordml/sdtdatahash" xmlns:w16se="http://schemas.microsoft.com/office/word/2015/wordml/symex" xmlns:wpg="http://schemas.microsoft.com/office/word/2010/wordprocessingGroup" xmlns:wpi="http://schemas.microsoft.com/office/word/2010/wordprocessingInk" xmlns:wne="http://schemas.microsoft.com/office/word/2006/wordml" xmlns:wps="http://schemas.microsoft.com/office/word/2010/wordprocessingShape" mc:Ignorable="w14 w15 w16se w16cid w16 w16cex w16sdtdh wp14">
+<w:ftr xmlns:wpc="http://schemas.microsoft.com/office/word/2010/wordprocessingCanvas" xmlns:cx="http://schemas.microsoft.com/office/drawing/2014/chartex" xmlns:cx1="http://schemas.microsoft.com/office/drawing/2015/9/8/chartex" xmlns:cx2="http://schemas.microsoft.com/office/drawing/2015/10/21/chartex" xmlns:cx3="http://schemas.microsoft.com/office/drawing/2016/5/9/chartex" xmlns:cx4="http://schemas.microsoft.com/office/drawing/2016/5/10/chartex" xmlns:cx5="http://schemas.microsoft.com/office/drawing/2016/5/11/chartex" xmlns:cx6="http://schemas.microsoft.com/office/drawing/2016/5/12/chartex" xmlns:cx7="http://schemas.microsoft.com/office/drawing/2016/5/13/chartex" xmlns:cx8="http://schemas.microsoft.com/office/drawing/2016/5/14/chartex" xmlns:mc="http://schemas.openxmlformats.org/markup-compatibility/2006" xmlns:aink="http://schemas.microsoft.com/office/drawing/2016/ink" xmlns:am3d="http://schemas.microsoft.com/office/drawing/2017/model3d" xmlns:o="urn:schemas-microsoft-com:office:office" xmlns:oel="http://schemas.microsoft.com/office/2019/extlst" xmlns:r="http://schemas.openxmlformats.org/officeDocument/2006/relationships" xmlns:m="http://schemas.openxmlformats.org/officeDocument/2006/math" xmlns:v="urn:schemas-microsoft-com:vml" xmlns:wp14="http://schemas.microsoft.com/office/word/2010/wordprocessingDrawing" xmlns:wp="http://schemas.openxmlformats.org/drawingml/2006/wordprocessingDrawing" xmlns:w10="urn:schemas-microsoft-com:office:word" xmlns:w="http://schemas.openxmlformats.org/wordprocessingml/2006/main" xmlns:w14="http://schemas.microsoft.com/office/word/2010/wordml" xmlns:w15="http://schemas.microsoft.com/office/word/2012/wordml" xmlns:w16cex="http://schemas.microsoft.com/office/word/2018/wordml/cex" xmlns:w16cid="http://schemas.microsoft.com/office/word/2016/wordml/cid" xmlns:w16="http://schemas.microsoft.com/office/word/2018/wordml" xmlns:w16du="http://schemas.microsoft.com/office/word/2023/wordml/word16du" xmlns:w16sdtdh="http://schemas.microsoft.com/office/word/2020/wordml/sdtdatahash" xmlns:w16sdtfl="http://schemas.microsoft.com/office/word/2024/wordml/sdtformatlock" xmlns:w16se="http://schemas.microsoft.com/office/word/2015/wordml/symex" xmlns:wpg="http://schemas.microsoft.com/office/word/2010/wordprocessingGroup" xmlns:wpi="http://schemas.microsoft.com/office/word/2010/wordprocessingInk" xmlns:wne="http://schemas.microsoft.com/office/word/2006/wordml" xmlns:wps="http://schemas.microsoft.com/office/word/2010/wordprocessingShape" mc:Ignorable="w14 w15 w16se w16cid w16 w16cex w16sdtdh w16sdtfl w16du wp14">
   <w:p>
     <w:pPr>
       <w:pStyle w:val="Fuzeile"/>
@@ -1640,7 +1333,7 @@
 </file>
 
 <file path=word/footer2.xml><?xml version="1.0" encoding="utf-8"?>
-<w:ftr xmlns:wpc="http://schemas.microsoft.com/office/word/2010/wordprocessingCanvas" xmlns:cx="http://schemas.microsoft.com/office/drawing/2014/chartex" xmlns:cx1="http://schemas.microsoft.com/office/drawing/2015/9/8/chartex" xmlns:cx2="http://schemas.microsoft.com/office/drawing/2015/10/21/chartex" xmlns:cx3="http://schemas.microsoft.com/office/drawing/2016/5/9/chartex" xmlns:cx4="http://schemas.microsoft.com/office/drawing/2016/5/10/chartex" xmlns:cx5="http://schemas.microsoft.com/office/drawing/2016/5/11/chartex" xmlns:cx6="http://schemas.microsoft.com/office/drawing/2016/5/12/chartex" xmlns:cx7="http://schemas.microsoft.com/office/drawing/2016/5/13/chartex" xmlns:cx8="http://schemas.microsoft.com/office/drawing/2016/5/14/chartex" xmlns:mc="http://schemas.openxmlformats.org/markup-compatibility/2006" xmlns:aink="http://schemas.microsoft.com/office/drawing/2016/ink" xmlns:am3d="http://schemas.microsoft.com/office/drawing/2017/model3d" xmlns:o="urn:schemas-microsoft-com:office:office" xmlns:oel="http://schemas.microsoft.com/office/2019/extlst" xmlns:r="http://schemas.openxmlformats.org/officeDocument/2006/relationships" xmlns:m="http://schemas.openxmlformats.org/officeDocument/2006/math" xmlns:v="urn:schemas-microsoft-com:vml" xmlns:wp14="http://schemas.microsoft.com/office/word/2010/wordprocessingDrawing" xmlns:wp="http://schemas.openxmlformats.org/drawingml/2006/wordprocessingDrawing" xmlns:w10="urn:schemas-microsoft-com:office:word" xmlns:w="http://schemas.openxmlformats.org/wordprocessingml/2006/main" xmlns:w14="http://schemas.microsoft.com/office/word/2010/wordml" xmlns:w15="http://schemas.microsoft.com/office/word/2012/wordml" xmlns:w16cex="http://schemas.microsoft.com/office/word/2018/wordml/cex" xmlns:w16cid="http://schemas.microsoft.com/office/word/2016/wordml/cid" xmlns:w16="http://schemas.microsoft.com/office/word/2018/wordml" xmlns:w16sdtdh="http://schemas.microsoft.com/office/word/2020/wordml/sdtdatahash" xmlns:w16se="http://schemas.microsoft.com/office/word/2015/wordml/symex" xmlns:wpg="http://schemas.microsoft.com/office/word/2010/wordprocessingGroup" xmlns:wpi="http://schemas.microsoft.com/office/word/2010/wordprocessingInk" xmlns:wne="http://schemas.microsoft.com/office/word/2006/wordml" xmlns:wps="http://schemas.microsoft.com/office/word/2010/wordprocessingShape" mc:Ignorable="w14 w15 w16se w16cid w16 w16cex w16sdtdh wp14">
+<w:ftr xmlns:wpc="http://schemas.microsoft.com/office/word/2010/wordprocessingCanvas" xmlns:cx="http://schemas.microsoft.com/office/drawing/2014/chartex" xmlns:cx1="http://schemas.microsoft.com/office/drawing/2015/9/8/chartex" xmlns:cx2="http://schemas.microsoft.com/office/drawing/2015/10/21/chartex" xmlns:cx3="http://schemas.microsoft.com/office/drawing/2016/5/9/chartex" xmlns:cx4="http://schemas.microsoft.com/office/drawing/2016/5/10/chartex" xmlns:cx5="http://schemas.microsoft.com/office/drawing/2016/5/11/chartex" xmlns:cx6="http://schemas.microsoft.com/office/drawing/2016/5/12/chartex" xmlns:cx7="http://schemas.microsoft.com/office/drawing/2016/5/13/chartex" xmlns:cx8="http://schemas.microsoft.com/office/drawing/2016/5/14/chartex" xmlns:mc="http://schemas.openxmlformats.org/markup-compatibility/2006" xmlns:aink="http://schemas.microsoft.com/office/drawing/2016/ink" xmlns:am3d="http://schemas.microsoft.com/office/drawing/2017/model3d" xmlns:o="urn:schemas-microsoft-com:office:office" xmlns:oel="http://schemas.microsoft.com/office/2019/extlst" xmlns:r="http://schemas.openxmlformats.org/officeDocument/2006/relationships" xmlns:m="http://schemas.openxmlformats.org/officeDocument/2006/math" xmlns:v="urn:schemas-microsoft-com:vml" xmlns:wp14="http://schemas.microsoft.com/office/word/2010/wordprocessingDrawing" xmlns:wp="http://schemas.openxmlformats.org/drawingml/2006/wordprocessingDrawing" xmlns:w10="urn:schemas-microsoft-com:office:word" xmlns:w="http://schemas.openxmlformats.org/wordprocessingml/2006/main" xmlns:w14="http://schemas.microsoft.com/office/word/2010/wordml" xmlns:w15="http://schemas.microsoft.com/office/word/2012/wordml" xmlns:w16cex="http://schemas.microsoft.com/office/word/2018/wordml/cex" xmlns:w16cid="http://schemas.microsoft.com/office/word/2016/wordml/cid" xmlns:w16="http://schemas.microsoft.com/office/word/2018/wordml" xmlns:w16du="http://schemas.microsoft.com/office/word/2023/wordml/word16du" xmlns:w16sdtdh="http://schemas.microsoft.com/office/word/2020/wordml/sdtdatahash" xmlns:w16sdtfl="http://schemas.microsoft.com/office/word/2024/wordml/sdtformatlock" xmlns:w16se="http://schemas.microsoft.com/office/word/2015/wordml/symex" xmlns:wpg="http://schemas.microsoft.com/office/word/2010/wordprocessingGroup" xmlns:wpi="http://schemas.microsoft.com/office/word/2010/wordprocessingInk" xmlns:wne="http://schemas.microsoft.com/office/word/2006/wordml" xmlns:wps="http://schemas.microsoft.com/office/word/2010/wordprocessingShape" mc:Ignorable="w14 w15 w16se w16cid w16 w16cex w16sdtdh w16sdtfl w16du wp14">
   <w:p>
     <w:pPr>
       <w:pStyle w:val="Fuzeile"/>
@@ -1650,7 +1343,7 @@
 </file>
 
 <file path=word/footer3.xml><?xml version="1.0" encoding="utf-8"?>
-<w:ftr xmlns:wpc="http://schemas.microsoft.com/office/word/2010/wordprocessingCanvas" xmlns:cx="http://schemas.microsoft.com/office/drawing/2014/chartex" xmlns:cx1="http://schemas.microsoft.com/office/drawing/2015/9/8/chartex" xmlns:cx2="http://schemas.microsoft.com/office/drawing/2015/10/21/chartex" xmlns:cx3="http://schemas.microsoft.com/office/drawing/2016/5/9/chartex" xmlns:cx4="http://schemas.microsoft.com/office/drawing/2016/5/10/chartex" xmlns:cx5="http://schemas.microsoft.com/office/drawing/2016/5/11/chartex" xmlns:cx6="http://schemas.microsoft.com/office/drawing/2016/5/12/chartex" xmlns:cx7="http://schemas.microsoft.com/office/drawing/2016/5/13/chartex" xmlns:cx8="http://schemas.microsoft.com/office/drawing/2016/5/14/chartex" xmlns:mc="http://schemas.openxmlformats.org/markup-compatibility/2006" xmlns:aink="http://schemas.microsoft.com/office/drawing/2016/ink" xmlns:am3d="http://schemas.microsoft.com/office/drawing/2017/model3d" xmlns:o="urn:schemas-microsoft-com:office:office" xmlns:oel="http://schemas.microsoft.com/office/2019/extlst" xmlns:r="http://schemas.openxmlformats.org/officeDocument/2006/relationships" xmlns:m="http://schemas.openxmlformats.org/officeDocument/2006/math" xmlns:v="urn:schemas-microsoft-com:vml" xmlns:wp14="http://schemas.microsoft.com/office/word/2010/wordprocessingDrawing" xmlns:wp="http://schemas.openxmlformats.org/drawingml/2006/wordprocessingDrawing" xmlns:w10="urn:schemas-microsoft-com:office:word" xmlns:w="http://schemas.openxmlformats.org/wordprocessingml/2006/main" xmlns:w14="http://schemas.microsoft.com/office/word/2010/wordml" xmlns:w15="http://schemas.microsoft.com/office/word/2012/wordml" xmlns:w16cex="http://schemas.microsoft.com/office/word/2018/wordml/cex" xmlns:w16cid="http://schemas.microsoft.com/office/word/2016/wordml/cid" xmlns:w16="http://schemas.microsoft.com/office/word/2018/wordml" xmlns:w16sdtdh="http://schemas.microsoft.com/office/word/2020/wordml/sdtdatahash" xmlns:w16se="http://schemas.microsoft.com/office/word/2015/wordml/symex" xmlns:wpg="http://schemas.microsoft.com/office/word/2010/wordprocessingGroup" xmlns:wpi="http://schemas.microsoft.com/office/word/2010/wordprocessingInk" xmlns:wne="http://schemas.microsoft.com/office/word/2006/wordml" xmlns:wps="http://schemas.microsoft.com/office/word/2010/wordprocessingShape" mc:Ignorable="w14 w15 w16se w16cid w16 w16cex w16sdtdh wp14">
+<w:ftr xmlns:wpc="http://schemas.microsoft.com/office/word/2010/wordprocessingCanvas" xmlns:cx="http://schemas.microsoft.com/office/drawing/2014/chartex" xmlns:cx1="http://schemas.microsoft.com/office/drawing/2015/9/8/chartex" xmlns:cx2="http://schemas.microsoft.com/office/drawing/2015/10/21/chartex" xmlns:cx3="http://schemas.microsoft.com/office/drawing/2016/5/9/chartex" xmlns:cx4="http://schemas.microsoft.com/office/drawing/2016/5/10/chartex" xmlns:cx5="http://schemas.microsoft.com/office/drawing/2016/5/11/chartex" xmlns:cx6="http://schemas.microsoft.com/office/drawing/2016/5/12/chartex" xmlns:cx7="http://schemas.microsoft.com/office/drawing/2016/5/13/chartex" xmlns:cx8="http://schemas.microsoft.com/office/drawing/2016/5/14/chartex" xmlns:mc="http://schemas.openxmlformats.org/markup-compatibility/2006" xmlns:aink="http://schemas.microsoft.com/office/drawing/2016/ink" xmlns:am3d="http://schemas.microsoft.com/office/drawing/2017/model3d" xmlns:o="urn:schemas-microsoft-com:office:office" xmlns:oel="http://schemas.microsoft.com/office/2019/extlst" xmlns:r="http://schemas.openxmlformats.org/officeDocument/2006/relationships" xmlns:m="http://schemas.openxmlformats.org/officeDocument/2006/math" xmlns:v="urn:schemas-microsoft-com:vml" xmlns:wp14="http://schemas.microsoft.com/office/word/2010/wordprocessingDrawing" xmlns:wp="http://schemas.openxmlformats.org/drawingml/2006/wordprocessingDrawing" xmlns:w10="urn:schemas-microsoft-com:office:word" xmlns:w="http://schemas.openxmlformats.org/wordprocessingml/2006/main" xmlns:w14="http://schemas.microsoft.com/office/word/2010/wordml" xmlns:w15="http://schemas.microsoft.com/office/word/2012/wordml" xmlns:w16cex="http://schemas.microsoft.com/office/word/2018/wordml/cex" xmlns:w16cid="http://schemas.microsoft.com/office/word/2016/wordml/cid" xmlns:w16="http://schemas.microsoft.com/office/word/2018/wordml" xmlns:w16du="http://schemas.microsoft.com/office/word/2023/wordml/word16du" xmlns:w16sdtdh="http://schemas.microsoft.com/office/word/2020/wordml/sdtdatahash" xmlns:w16sdtfl="http://schemas.microsoft.com/office/word/2024/wordml/sdtformatlock" xmlns:w16se="http://schemas.microsoft.com/office/word/2015/wordml/symex" xmlns:wpg="http://schemas.microsoft.com/office/word/2010/wordprocessingGroup" xmlns:wpi="http://schemas.microsoft.com/office/word/2010/wordprocessingInk" xmlns:wne="http://schemas.microsoft.com/office/word/2006/wordml" xmlns:wps="http://schemas.microsoft.com/office/word/2010/wordprocessingShape" mc:Ignorable="w14 w15 w16se w16cid w16 w16cex w16sdtdh w16sdtfl w16du wp14">
   <w:p>
     <w:pPr>
       <w:pStyle w:val="Fuzeile"/>
@@ -1660,7 +1353,7 @@
 </file>
 
 <file path=word/footnotes.xml><?xml version="1.0" encoding="utf-8"?>
-<w:footnotes xmlns:wpc="http://schemas.microsoft.com/office/word/2010/wordprocessingCanvas" xmlns:cx="http://schemas.microsoft.com/office/drawing/2014/chartex" xmlns:cx1="http://schemas.microsoft.com/office/drawing/2015/9/8/chartex" xmlns:cx2="http://schemas.microsoft.com/office/drawing/2015/10/21/chartex" xmlns:cx3="http://schemas.microsoft.com/office/drawing/2016/5/9/chartex" xmlns:cx4="http://schemas.microsoft.com/office/drawing/2016/5/10/chartex" xmlns:cx5="http://schemas.microsoft.com/office/drawing/2016/5/11/chartex" xmlns:cx6="http://schemas.microsoft.com/office/drawing/2016/5/12/chartex" xmlns:cx7="http://schemas.microsoft.com/office/drawing/2016/5/13/chartex" xmlns:cx8="http://schemas.microsoft.com/office/drawing/2016/5/14/chartex" xmlns:mc="http://schemas.openxmlformats.org/markup-compatibility/2006" xmlns:aink="http://schemas.microsoft.com/office/drawing/2016/ink" xmlns:am3d="http://schemas.microsoft.com/office/drawing/2017/model3d" xmlns:o="urn:schemas-microsoft-com:office:office" xmlns:oel="http://schemas.microsoft.com/office/2019/extlst" xmlns:r="http://schemas.openxmlformats.org/officeDocument/2006/relationships" xmlns:m="http://schemas.openxmlformats.org/officeDocument/2006/math" xmlns:v="urn:schemas-microsoft-com:vml" xmlns:wp14="http://schemas.microsoft.com/office/word/2010/wordprocessingDrawing" xmlns:wp="http://schemas.openxmlformats.org/drawingml/2006/wordprocessingDrawing" xmlns:w10="urn:schemas-microsoft-com:office:word" xmlns:w="http://schemas.openxmlformats.org/wordprocessingml/2006/main" xmlns:w14="http://schemas.microsoft.com/office/word/2010/wordml" xmlns:w15="http://schemas.microsoft.com/office/word/2012/wordml" xmlns:w16cex="http://schemas.microsoft.com/office/word/2018/wordml/cex" xmlns:w16cid="http://schemas.microsoft.com/office/word/2016/wordml/cid" xmlns:w16="http://schemas.microsoft.com/office/word/2018/wordml" xmlns:w16sdtdh="http://schemas.microsoft.com/office/word/2020/wordml/sdtdatahash" xmlns:w16se="http://schemas.microsoft.com/office/word/2015/wordml/symex" xmlns:wpg="http://schemas.microsoft.com/office/word/2010/wordprocessingGroup" xmlns:wpi="http://schemas.microsoft.com/office/word/2010/wordprocessingInk" xmlns:wne="http://schemas.microsoft.com/office/word/2006/wordml" xmlns:wps="http://schemas.microsoft.com/office/word/2010/wordprocessingShape" mc:Ignorable="w14 w15 w16se w16cid w16 w16cex w16sdtdh wp14">
+<w:footnotes xmlns:wpc="http://schemas.microsoft.com/office/word/2010/wordprocessingCanvas" xmlns:cx="http://schemas.microsoft.com/office/drawing/2014/chartex" xmlns:cx1="http://schemas.microsoft.com/office/drawing/2015/9/8/chartex" xmlns:cx2="http://schemas.microsoft.com/office/drawing/2015/10/21/chartex" xmlns:cx3="http://schemas.microsoft.com/office/drawing/2016/5/9/chartex" xmlns:cx4="http://schemas.microsoft.com/office/drawing/2016/5/10/chartex" xmlns:cx5="http://schemas.microsoft.com/office/drawing/2016/5/11/chartex" xmlns:cx6="http://schemas.microsoft.com/office/drawing/2016/5/12/chartex" xmlns:cx7="http://schemas.microsoft.com/office/drawing/2016/5/13/chartex" xmlns:cx8="http://schemas.microsoft.com/office/drawing/2016/5/14/chartex" xmlns:mc="http://schemas.openxmlformats.org/markup-compatibility/2006" xmlns:aink="http://schemas.microsoft.com/office/drawing/2016/ink" xmlns:am3d="http://schemas.microsoft.com/office/drawing/2017/model3d" xmlns:o="urn:schemas-microsoft-com:office:office" xmlns:oel="http://schemas.microsoft.com/office/2019/extlst" xmlns:r="http://schemas.openxmlformats.org/officeDocument/2006/relationships" xmlns:m="http://schemas.openxmlformats.org/officeDocument/2006/math" xmlns:v="urn:schemas-microsoft-com:vml" xmlns:wp14="http://schemas.microsoft.com/office/word/2010/wordprocessingDrawing" xmlns:wp="http://schemas.openxmlformats.org/drawingml/2006/wordprocessingDrawing" xmlns:w10="urn:schemas-microsoft-com:office:word" xmlns:w="http://schemas.openxmlformats.org/wordprocessingml/2006/main" xmlns:w14="http://schemas.microsoft.com/office/word/2010/wordml" xmlns:w15="http://schemas.microsoft.com/office/word/2012/wordml" xmlns:w16cex="http://schemas.microsoft.com/office/word/2018/wordml/cex" xmlns:w16cid="http://schemas.microsoft.com/office/word/2016/wordml/cid" xmlns:w16="http://schemas.microsoft.com/office/word/2018/wordml" xmlns:w16du="http://schemas.microsoft.com/office/word/2023/wordml/word16du" xmlns:w16sdtdh="http://schemas.microsoft.com/office/word/2020/wordml/sdtdatahash" xmlns:w16sdtfl="http://schemas.microsoft.com/office/word/2024/wordml/sdtformatlock" xmlns:w16se="http://schemas.microsoft.com/office/word/2015/wordml/symex" xmlns:wpg="http://schemas.microsoft.com/office/word/2010/wordprocessingGroup" xmlns:wpi="http://schemas.microsoft.com/office/word/2010/wordprocessingInk" xmlns:wne="http://schemas.microsoft.com/office/word/2006/wordml" xmlns:wps="http://schemas.microsoft.com/office/word/2010/wordprocessingShape" mc:Ignorable="w14 w15 w16se w16cid w16 w16cex w16sdtdh w16sdtfl w16du wp14">
   <w:footnote w:type="separator" w:id="-1">
     <w:p>
       <w:pPr>
@@ -1685,7 +1378,7 @@
 </file>
 
 <file path=word/header1.xml><?xml version="1.0" encoding="utf-8"?>
-<w:hdr xmlns:wpc="http://schemas.microsoft.com/office/word/2010/wordprocessingCanvas" xmlns:cx="http://schemas.microsoft.com/office/drawing/2014/chartex" xmlns:cx1="http://schemas.microsoft.com/office/drawing/2015/9/8/chartex" xmlns:cx2="http://schemas.microsoft.com/office/drawing/2015/10/21/chartex" xmlns:cx3="http://schemas.microsoft.com/office/drawing/2016/5/9/chartex" xmlns:cx4="http://schemas.microsoft.com/office/drawing/2016/5/10/chartex" xmlns:cx5="http://schemas.microsoft.com/office/drawing/2016/5/11/chartex" xmlns:cx6="http://schemas.microsoft.com/office/drawing/2016/5/12/chartex" xmlns:cx7="http://schemas.microsoft.com/office/drawing/2016/5/13/chartex" xmlns:cx8="http://schemas.microsoft.com/office/drawing/2016/5/14/chartex" xmlns:mc="http://schemas.openxmlformats.org/markup-compatibility/2006" xmlns:aink="http://schemas.microsoft.com/office/drawing/2016/ink" xmlns:am3d="http://schemas.microsoft.com/office/drawing/2017/model3d" xmlns:o="urn:schemas-microsoft-com:office:office" xmlns:oel="http://schemas.microsoft.com/office/2019/extlst" xmlns:r="http://schemas.openxmlformats.org/officeDocument/2006/relationships" xmlns:m="http://schemas.openxmlformats.org/officeDocument/2006/math" xmlns:v="urn:schemas-microsoft-com:vml" xmlns:wp14="http://schemas.microsoft.com/office/word/2010/wordprocessingDrawing" xmlns:wp="http://schemas.openxmlformats.org/drawingml/2006/wordprocessingDrawing" xmlns:w10="urn:schemas-microsoft-com:office:word" xmlns:w="http://schemas.openxmlformats.org/wordprocessingml/2006/main" xmlns:w14="http://schemas.microsoft.com/office/word/2010/wordml" xmlns:w15="http://schemas.microsoft.com/office/word/2012/wordml" xmlns:w16cex="http://schemas.microsoft.com/office/word/2018/wordml/cex" xmlns:w16cid="http://schemas.microsoft.com/office/word/2016/wordml/cid" xmlns:w16="http://schemas.microsoft.com/office/word/2018/wordml" xmlns:w16sdtdh="http://schemas.microsoft.com/office/word/2020/wordml/sdtdatahash" xmlns:w16se="http://schemas.microsoft.com/office/word/2015/wordml/symex" xmlns:wpg="http://schemas.microsoft.com/office/word/2010/wordprocessingGroup" xmlns:wpi="http://schemas.microsoft.com/office/word/2010/wordprocessingInk" xmlns:wne="http://schemas.microsoft.com/office/word/2006/wordml" xmlns:wps="http://schemas.microsoft.com/office/word/2010/wordprocessingShape" mc:Ignorable="w14 w15 w16se w16cid w16 w16cex w16sdtdh wp14">
+<w:hdr xmlns:wpc="http://schemas.microsoft.com/office/word/2010/wordprocessingCanvas" xmlns:cx="http://schemas.microsoft.com/office/drawing/2014/chartex" xmlns:cx1="http://schemas.microsoft.com/office/drawing/2015/9/8/chartex" xmlns:cx2="http://schemas.microsoft.com/office/drawing/2015/10/21/chartex" xmlns:cx3="http://schemas.microsoft.com/office/drawing/2016/5/9/chartex" xmlns:cx4="http://schemas.microsoft.com/office/drawing/2016/5/10/chartex" xmlns:cx5="http://schemas.microsoft.com/office/drawing/2016/5/11/chartex" xmlns:cx6="http://schemas.microsoft.com/office/drawing/2016/5/12/chartex" xmlns:cx7="http://schemas.microsoft.com/office/drawing/2016/5/13/chartex" xmlns:cx8="http://schemas.microsoft.com/office/drawing/2016/5/14/chartex" xmlns:mc="http://schemas.openxmlformats.org/markup-compatibility/2006" xmlns:aink="http://schemas.microsoft.com/office/drawing/2016/ink" xmlns:am3d="http://schemas.microsoft.com/office/drawing/2017/model3d" xmlns:o="urn:schemas-microsoft-com:office:office" xmlns:oel="http://schemas.microsoft.com/office/2019/extlst" xmlns:r="http://schemas.openxmlformats.org/officeDocument/2006/relationships" xmlns:m="http://schemas.openxmlformats.org/officeDocument/2006/math" xmlns:v="urn:schemas-microsoft-com:vml" xmlns:wp14="http://schemas.microsoft.com/office/word/2010/wordprocessingDrawing" xmlns:wp="http://schemas.openxmlformats.org/drawingml/2006/wordprocessingDrawing" xmlns:w10="urn:schemas-microsoft-com:office:word" xmlns:w="http://schemas.openxmlformats.org/wordprocessingml/2006/main" xmlns:w14="http://schemas.microsoft.com/office/word/2010/wordml" xmlns:w15="http://schemas.microsoft.com/office/word/2012/wordml" xmlns:w16cex="http://schemas.microsoft.com/office/word/2018/wordml/cex" xmlns:w16cid="http://schemas.microsoft.com/office/word/2016/wordml/cid" xmlns:w16="http://schemas.microsoft.com/office/word/2018/wordml" xmlns:w16du="http://schemas.microsoft.com/office/word/2023/wordml/word16du" xmlns:w16sdtdh="http://schemas.microsoft.com/office/word/2020/wordml/sdtdatahash" xmlns:w16sdtfl="http://schemas.microsoft.com/office/word/2024/wordml/sdtformatlock" xmlns:w16se="http://schemas.microsoft.com/office/word/2015/wordml/symex" xmlns:wpg="http://schemas.microsoft.com/office/word/2010/wordprocessingGroup" xmlns:wpi="http://schemas.microsoft.com/office/word/2010/wordprocessingInk" xmlns:wne="http://schemas.microsoft.com/office/word/2006/wordml" xmlns:wps="http://schemas.microsoft.com/office/word/2010/wordprocessingShape" mc:Ignorable="w14 w15 w16se w16cid w16 w16cex w16sdtdh w16sdtfl w16du wp14">
   <w:p>
     <w:pPr>
       <w:pStyle w:val="Kopfzeile"/>
@@ -1695,7 +1388,7 @@
 </file>
 
 <file path=word/header2.xml><?xml version="1.0" encoding="utf-8"?>
-<w:hdr xmlns:wpc="http://schemas.microsoft.com/office/word/2010/wordprocessingCanvas" xmlns:cx="http://schemas.microsoft.com/office/drawing/2014/chartex" xmlns:cx1="http://schemas.microsoft.com/office/drawing/2015/9/8/chartex" xmlns:cx2="http://schemas.microsoft.com/office/drawing/2015/10/21/chartex" xmlns:cx3="http://schemas.microsoft.com/office/drawing/2016/5/9/chartex" xmlns:cx4="http://schemas.microsoft.com/office/drawing/2016/5/10/chartex" xmlns:cx5="http://schemas.microsoft.com/office/drawing/2016/5/11/chartex" xmlns:cx6="http://schemas.microsoft.com/office/drawing/2016/5/12/chartex" xmlns:cx7="http://schemas.microsoft.com/office/drawing/2016/5/13/chartex" xmlns:cx8="http://schemas.microsoft.com/office/drawing/2016/5/14/chartex" xmlns:mc="http://schemas.openxmlformats.org/markup-compatibility/2006" xmlns:aink="http://schemas.microsoft.com/office/drawing/2016/ink" xmlns:am3d="http://schemas.microsoft.com/office/drawing/2017/model3d" xmlns:o="urn:schemas-microsoft-com:office:office" xmlns:oel="http://schemas.microsoft.com/office/2019/extlst" xmlns:r="http://schemas.openxmlformats.org/officeDocument/2006/relationships" xmlns:m="http://schemas.openxmlformats.org/officeDocument/2006/math" xmlns:v="urn:schemas-microsoft-com:vml" xmlns:wp14="http://schemas.microsoft.com/office/word/2010/wordprocessingDrawing" xmlns:wp="http://schemas.openxmlformats.org/drawingml/2006/wordprocessingDrawing" xmlns:w10="urn:schemas-microsoft-com:office:word" xmlns:w="http://schemas.openxmlformats.org/wordprocessingml/2006/main" xmlns:w14="http://schemas.microsoft.com/office/word/2010/wordml" xmlns:w15="http://schemas.microsoft.com/office/word/2012/wordml" xmlns:w16cex="http://schemas.microsoft.com/office/word/2018/wordml/cex" xmlns:w16cid="http://schemas.microsoft.com/office/word/2016/wordml/cid" xmlns:w16="http://schemas.microsoft.com/office/word/2018/wordml" xmlns:w16sdtdh="http://schemas.microsoft.com/office/word/2020/wordml/sdtdatahash" xmlns:w16se="http://schemas.microsoft.com/office/word/2015/wordml/symex" xmlns:wpg="http://schemas.microsoft.com/office/word/2010/wordprocessingGroup" xmlns:wpi="http://schemas.microsoft.com/office/word/2010/wordprocessingInk" xmlns:wne="http://schemas.microsoft.com/office/word/2006/wordml" xmlns:wps="http://schemas.microsoft.com/office/word/2010/wordprocessingShape" mc:Ignorable="w14 w15 w16se w16cid w16 w16cex w16sdtdh wp14">
+<w:hdr xmlns:wpc="http://schemas.microsoft.com/office/word/2010/wordprocessingCanvas" xmlns:cx="http://schemas.microsoft.com/office/drawing/2014/chartex" xmlns:cx1="http://schemas.microsoft.com/office/drawing/2015/9/8/chartex" xmlns:cx2="http://schemas.microsoft.com/office/drawing/2015/10/21/chartex" xmlns:cx3="http://schemas.microsoft.com/office/drawing/2016/5/9/chartex" xmlns:cx4="http://schemas.microsoft.com/office/drawing/2016/5/10/chartex" xmlns:cx5="http://schemas.microsoft.com/office/drawing/2016/5/11/chartex" xmlns:cx6="http://schemas.microsoft.com/office/drawing/2016/5/12/chartex" xmlns:cx7="http://schemas.microsoft.com/office/drawing/2016/5/13/chartex" xmlns:cx8="http://schemas.microsoft.com/office/drawing/2016/5/14/chartex" xmlns:mc="http://schemas.openxmlformats.org/markup-compatibility/2006" xmlns:aink="http://schemas.microsoft.com/office/drawing/2016/ink" xmlns:am3d="http://schemas.microsoft.com/office/drawing/2017/model3d" xmlns:o="urn:schemas-microsoft-com:office:office" xmlns:oel="http://schemas.microsoft.com/office/2019/extlst" xmlns:r="http://schemas.openxmlformats.org/officeDocument/2006/relationships" xmlns:m="http://schemas.openxmlformats.org/officeDocument/2006/math" xmlns:v="urn:schemas-microsoft-com:vml" xmlns:wp14="http://schemas.microsoft.com/office/word/2010/wordprocessingDrawing" xmlns:wp="http://schemas.openxmlformats.org/drawingml/2006/wordprocessingDrawing" xmlns:w10="urn:schemas-microsoft-com:office:word" xmlns:w="http://schemas.openxmlformats.org/wordprocessingml/2006/main" xmlns:w14="http://schemas.microsoft.com/office/word/2010/wordml" xmlns:w15="http://schemas.microsoft.com/office/word/2012/wordml" xmlns:w16cex="http://schemas.microsoft.com/office/word/2018/wordml/cex" xmlns:w16cid="http://schemas.microsoft.com/office/word/2016/wordml/cid" xmlns:w16="http://schemas.microsoft.com/office/word/2018/wordml" xmlns:w16du="http://schemas.microsoft.com/office/word/2023/wordml/word16du" xmlns:w16sdtdh="http://schemas.microsoft.com/office/word/2020/wordml/sdtdatahash" xmlns:w16sdtfl="http://schemas.microsoft.com/office/word/2024/wordml/sdtformatlock" xmlns:w16se="http://schemas.microsoft.com/office/word/2015/wordml/symex" xmlns:wpg="http://schemas.microsoft.com/office/word/2010/wordprocessingGroup" xmlns:wpi="http://schemas.microsoft.com/office/word/2010/wordprocessingInk" xmlns:wne="http://schemas.microsoft.com/office/word/2006/wordml" xmlns:wps="http://schemas.microsoft.com/office/word/2010/wordprocessingShape" mc:Ignorable="w14 w15 w16se w16cid w16 w16cex w16sdtdh w16sdtfl w16du wp14">
   <w:p>
     <w:pPr>
       <w:pStyle w:val="Kopfzeile"/>
@@ -1755,7 +1448,7 @@
 </file>
 
 <file path=word/header3.xml><?xml version="1.0" encoding="utf-8"?>
-<w:hdr xmlns:wpc="http://schemas.microsoft.com/office/word/2010/wordprocessingCanvas" xmlns:cx="http://schemas.microsoft.com/office/drawing/2014/chartex" xmlns:cx1="http://schemas.microsoft.com/office/drawing/2015/9/8/chartex" xmlns:cx2="http://schemas.microsoft.com/office/drawing/2015/10/21/chartex" xmlns:cx3="http://schemas.microsoft.com/office/drawing/2016/5/9/chartex" xmlns:cx4="http://schemas.microsoft.com/office/drawing/2016/5/10/chartex" xmlns:cx5="http://schemas.microsoft.com/office/drawing/2016/5/11/chartex" xmlns:cx6="http://schemas.microsoft.com/office/drawing/2016/5/12/chartex" xmlns:cx7="http://schemas.microsoft.com/office/drawing/2016/5/13/chartex" xmlns:cx8="http://schemas.microsoft.com/office/drawing/2016/5/14/chartex" xmlns:mc="http://schemas.openxmlformats.org/markup-compatibility/2006" xmlns:aink="http://schemas.microsoft.com/office/drawing/2016/ink" xmlns:am3d="http://schemas.microsoft.com/office/drawing/2017/model3d" xmlns:o="urn:schemas-microsoft-com:office:office" xmlns:oel="http://schemas.microsoft.com/office/2019/extlst" xmlns:r="http://schemas.openxmlformats.org/officeDocument/2006/relationships" xmlns:m="http://schemas.openxmlformats.org/officeDocument/2006/math" xmlns:v="urn:schemas-microsoft-com:vml" xmlns:wp14="http://schemas.microsoft.com/office/word/2010/wordprocessingDrawing" xmlns:wp="http://schemas.openxmlformats.org/drawingml/2006/wordprocessingDrawing" xmlns:w10="urn:schemas-microsoft-com:office:word" xmlns:w="http://schemas.openxmlformats.org/wordprocessingml/2006/main" xmlns:w14="http://schemas.microsoft.com/office/word/2010/wordml" xmlns:w15="http://schemas.microsoft.com/office/word/2012/wordml" xmlns:w16cex="http://schemas.microsoft.com/office/word/2018/wordml/cex" xmlns:w16cid="http://schemas.microsoft.com/office/word/2016/wordml/cid" xmlns:w16="http://schemas.microsoft.com/office/word/2018/wordml" xmlns:w16sdtdh="http://schemas.microsoft.com/office/word/2020/wordml/sdtdatahash" xmlns:w16se="http://schemas.microsoft.com/office/word/2015/wordml/symex" xmlns:wpg="http://schemas.microsoft.com/office/word/2010/wordprocessingGroup" xmlns:wpi="http://schemas.microsoft.com/office/word/2010/wordprocessingInk" xmlns:wne="http://schemas.microsoft.com/office/word/2006/wordml" xmlns:wps="http://schemas.microsoft.com/office/word/2010/wordprocessingShape" mc:Ignorable="w14 w15 w16se w16cid w16 w16cex w16sdtdh wp14">
+<w:hdr xmlns:wpc="http://schemas.microsoft.com/office/word/2010/wordprocessingCanvas" xmlns:cx="http://schemas.microsoft.com/office/drawing/2014/chartex" xmlns:cx1="http://schemas.microsoft.com/office/drawing/2015/9/8/chartex" xmlns:cx2="http://schemas.microsoft.com/office/drawing/2015/10/21/chartex" xmlns:cx3="http://schemas.microsoft.com/office/drawing/2016/5/9/chartex" xmlns:cx4="http://schemas.microsoft.com/office/drawing/2016/5/10/chartex" xmlns:cx5="http://schemas.microsoft.com/office/drawing/2016/5/11/chartex" xmlns:cx6="http://schemas.microsoft.com/office/drawing/2016/5/12/chartex" xmlns:cx7="http://schemas.microsoft.com/office/drawing/2016/5/13/chartex" xmlns:cx8="http://schemas.microsoft.com/office/drawing/2016/5/14/chartex" xmlns:mc="http://schemas.openxmlformats.org/markup-compatibility/2006" xmlns:aink="http://schemas.microsoft.com/office/drawing/2016/ink" xmlns:am3d="http://schemas.microsoft.com/office/drawing/2017/model3d" xmlns:o="urn:schemas-microsoft-com:office:office" xmlns:oel="http://schemas.microsoft.com/office/2019/extlst" xmlns:r="http://schemas.openxmlformats.org/officeDocument/2006/relationships" xmlns:m="http://schemas.openxmlformats.org/officeDocument/2006/math" xmlns:v="urn:schemas-microsoft-com:vml" xmlns:wp14="http://schemas.microsoft.com/office/word/2010/wordprocessingDrawing" xmlns:wp="http://schemas.openxmlformats.org/drawingml/2006/wordprocessingDrawing" xmlns:w10="urn:schemas-microsoft-com:office:word" xmlns:w="http://schemas.openxmlformats.org/wordprocessingml/2006/main" xmlns:w14="http://schemas.microsoft.com/office/word/2010/wordml" xmlns:w15="http://schemas.microsoft.com/office/word/2012/wordml" xmlns:w16cex="http://schemas.microsoft.com/office/word/2018/wordml/cex" xmlns:w16cid="http://schemas.microsoft.com/office/word/2016/wordml/cid" xmlns:w16="http://schemas.microsoft.com/office/word/2018/wordml" xmlns:w16du="http://schemas.microsoft.com/office/word/2023/wordml/word16du" xmlns:w16sdtdh="http://schemas.microsoft.com/office/word/2020/wordml/sdtdatahash" xmlns:w16sdtfl="http://schemas.microsoft.com/office/word/2024/wordml/sdtformatlock" xmlns:w16se="http://schemas.microsoft.com/office/word/2015/wordml/symex" xmlns:wpg="http://schemas.microsoft.com/office/word/2010/wordprocessingGroup" xmlns:wpi="http://schemas.microsoft.com/office/word/2010/wordprocessingInk" xmlns:wne="http://schemas.microsoft.com/office/word/2006/wordml" xmlns:wps="http://schemas.microsoft.com/office/word/2010/wordprocessingShape" mc:Ignorable="w14 w15 w16se w16cid w16 w16cex w16sdtdh w16sdtfl w16du wp14">
   <w:p>
     <w:pPr>
       <w:pStyle w:val="Kopfzeile"/>
@@ -1765,7 +1458,7 @@
 </file>
 
 <file path=word/numbering.xml><?xml version="1.0" encoding="utf-8"?>
-<w:numbering xmlns:wpc="http://schemas.microsoft.com/office/word/2010/wordprocessingCanvas" xmlns:cx="http://schemas.microsoft.com/office/drawing/2014/chartex" xmlns:cx1="http://schemas.microsoft.com/office/drawing/2015/9/8/chartex" xmlns:cx2="http://schemas.microsoft.com/office/drawing/2015/10/21/chartex" xmlns:cx3="http://schemas.microsoft.com/office/drawing/2016/5/9/chartex" xmlns:cx4="http://schemas.microsoft.com/office/drawing/2016/5/10/chartex" xmlns:cx5="http://schemas.microsoft.com/office/drawing/2016/5/11/chartex" xmlns:cx6="http://schemas.microsoft.com/office/drawing/2016/5/12/chartex" xmlns:cx7="http://schemas.microsoft.com/office/drawing/2016/5/13/chartex" xmlns:cx8="http://schemas.microsoft.com/office/drawing/2016/5/14/chartex" xmlns:mc="http://schemas.openxmlformats.org/markup-compatibility/2006" xmlns:aink="http://schemas.microsoft.com/office/drawing/2016/ink" xmlns:am3d="http://schemas.microsoft.com/office/drawing/2017/model3d" xmlns:o="urn:schemas-microsoft-com:office:office" xmlns:oel="http://schemas.microsoft.com/office/2019/extlst" xmlns:r="http://schemas.openxmlformats.org/officeDocument/2006/relationships" xmlns:m="http://schemas.openxmlformats.org/officeDocument/2006/math" xmlns:v="urn:schemas-microsoft-com:vml" xmlns:wp14="http://schemas.microsoft.com/office/word/2010/wordprocessingDrawing" xmlns:wp="http://schemas.openxmlformats.org/drawingml/2006/wordprocessingDrawing" xmlns:w10="urn:schemas-microsoft-com:office:word" xmlns:w="http://schemas.openxmlformats.org/wordprocessingml/2006/main" xmlns:w14="http://schemas.microsoft.com/office/word/2010/wordml" xmlns:w15="http://schemas.microsoft.com/office/word/2012/wordml" xmlns:w16cex="http://schemas.microsoft.com/office/word/2018/wordml/cex" xmlns:w16cid="http://schemas.microsoft.com/office/word/2016/wordml/cid" xmlns:w16="http://schemas.microsoft.com/office/word/2018/wordml" xmlns:w16sdtdh="http://schemas.microsoft.com/office/word/2020/wordml/sdtdatahash" xmlns:w16se="http://schemas.microsoft.com/office/word/2015/wordml/symex" xmlns:wpg="http://schemas.microsoft.com/office/word/2010/wordprocessingGroup" xmlns:wpi="http://schemas.microsoft.com/office/word/2010/wordprocessingInk" xmlns:wne="http://schemas.microsoft.com/office/word/2006/wordml" xmlns:wps="http://schemas.microsoft.com/office/word/2010/wordprocessingShape" mc:Ignorable="w14 w15 w16se w16cid w16 w16cex w16sdtdh wp14">
+<w:numbering xmlns:wpc="http://schemas.microsoft.com/office/word/2010/wordprocessingCanvas" xmlns:cx="http://schemas.microsoft.com/office/drawing/2014/chartex" xmlns:cx1="http://schemas.microsoft.com/office/drawing/2015/9/8/chartex" xmlns:cx2="http://schemas.microsoft.com/office/drawing/2015/10/21/chartex" xmlns:cx3="http://schemas.microsoft.com/office/drawing/2016/5/9/chartex" xmlns:cx4="http://schemas.microsoft.com/office/drawing/2016/5/10/chartex" xmlns:cx5="http://schemas.microsoft.com/office/drawing/2016/5/11/chartex" xmlns:cx6="http://schemas.microsoft.com/office/drawing/2016/5/12/chartex" xmlns:cx7="http://schemas.microsoft.com/office/drawing/2016/5/13/chartex" xmlns:cx8="http://schemas.microsoft.com/office/drawing/2016/5/14/chartex" xmlns:mc="http://schemas.openxmlformats.org/markup-compatibility/2006" xmlns:aink="http://schemas.microsoft.com/office/drawing/2016/ink" xmlns:am3d="http://schemas.microsoft.com/office/drawing/2017/model3d" xmlns:o="urn:schemas-microsoft-com:office:office" xmlns:oel="http://schemas.microsoft.com/office/2019/extlst" xmlns:r="http://schemas.openxmlformats.org/officeDocument/2006/relationships" xmlns:m="http://schemas.openxmlformats.org/officeDocument/2006/math" xmlns:v="urn:schemas-microsoft-com:vml" xmlns:wp14="http://schemas.microsoft.com/office/word/2010/wordprocessingDrawing" xmlns:wp="http://schemas.openxmlformats.org/drawingml/2006/wordprocessingDrawing" xmlns:w10="urn:schemas-microsoft-com:office:word" xmlns:w="http://schemas.openxmlformats.org/wordprocessingml/2006/main" xmlns:w14="http://schemas.microsoft.com/office/word/2010/wordml" xmlns:w15="http://schemas.microsoft.com/office/word/2012/wordml" xmlns:w16cex="http://schemas.microsoft.com/office/word/2018/wordml/cex" xmlns:w16cid="http://schemas.microsoft.com/office/word/2016/wordml/cid" xmlns:w16="http://schemas.microsoft.com/office/word/2018/wordml" xmlns:w16du="http://schemas.microsoft.com/office/word/2023/wordml/word16du" xmlns:w16sdtdh="http://schemas.microsoft.com/office/word/2020/wordml/sdtdatahash" xmlns:w16sdtfl="http://schemas.microsoft.com/office/word/2024/wordml/sdtformatlock" xmlns:w16se="http://schemas.microsoft.com/office/word/2015/wordml/symex" xmlns:wpg="http://schemas.microsoft.com/office/word/2010/wordprocessingGroup" xmlns:wpi="http://schemas.microsoft.com/office/word/2010/wordprocessingInk" xmlns:wne="http://schemas.microsoft.com/office/word/2006/wordml" xmlns:wps="http://schemas.microsoft.com/office/word/2010/wordprocessingShape" mc:Ignorable="w14 w15 w16se w16cid w16 w16cex w16sdtdh w16sdtfl w16du wp14">
   <w:abstractNum w:abstractNumId="0" w15:restartNumberingAfterBreak="0">
     <w:nsid w:val="51A902DE"/>
     <w:multiLevelType w:val="hybridMultilevel"/>
@@ -2000,7 +1693,7 @@
 </file>
 
 <file path=word/styles.xml><?xml version="1.0" encoding="utf-8"?>
-<w:styles xmlns:mc="http://schemas.openxmlformats.org/markup-compatibility/2006" xmlns:r="http://schemas.openxmlformats.org/officeDocument/2006/relationships" xmlns:w="http://schemas.openxmlformats.org/wordprocessingml/2006/main" xmlns:w14="http://schemas.microsoft.com/office/word/2010/wordml" xmlns:w15="http://schemas.microsoft.com/office/word/2012/wordml" xmlns:w16cex="http://schemas.microsoft.com/office/word/2018/wordml/cex" xmlns:w16cid="http://schemas.microsoft.com/office/word/2016/wordml/cid" xmlns:w16="http://schemas.microsoft.com/office/word/2018/wordml" xmlns:w16sdtdh="http://schemas.microsoft.com/office/word/2020/wordml/sdtdatahash" xmlns:w16se="http://schemas.microsoft.com/office/word/2015/wordml/symex" mc:Ignorable="w14 w15 w16se w16cid w16 w16cex w16sdtdh">
+<w:styles xmlns:mc="http://schemas.openxmlformats.org/markup-compatibility/2006" xmlns:r="http://schemas.openxmlformats.org/officeDocument/2006/relationships" xmlns:w="http://schemas.openxmlformats.org/wordprocessingml/2006/main" xmlns:w14="http://schemas.microsoft.com/office/word/2010/wordml" xmlns:w15="http://schemas.microsoft.com/office/word/2012/wordml" xmlns:w16cex="http://schemas.microsoft.com/office/word/2018/wordml/cex" xmlns:w16cid="http://schemas.microsoft.com/office/word/2016/wordml/cid" xmlns:w16="http://schemas.microsoft.com/office/word/2018/wordml" xmlns:w16du="http://schemas.microsoft.com/office/word/2023/wordml/word16du" xmlns:w16sdtdh="http://schemas.microsoft.com/office/word/2020/wordml/sdtdatahash" xmlns:w16sdtfl="http://schemas.microsoft.com/office/word/2024/wordml/sdtformatlock" xmlns:w16se="http://schemas.microsoft.com/office/word/2015/wordml/symex" mc:Ignorable="w14 w15 w16se w16cid w16 w16cex w16sdtdh w16sdtfl w16du">
   <w:docDefaults>
     <w:rPrDefault>
       <w:rPr>

</xml_diff>

<commit_message>
Add diet informations to the member list
Fix https://github.com/jonasmueller1/sac-pilatus-website/issues/201
</commit_message>
<xml_diff>
--- a/contao/templates/docx/event_memberlist.docx
+++ b/contao/templates/docx/event_memberlist.docx
@@ -38,7 +38,23 @@
           <w:sz w:val="20"/>
           <w:szCs w:val="20"/>
         </w:rPr>
-        <w:t>${courseId}</w:t>
+        <w:t>${</w:t>
+      </w:r>
+      <w:proofErr w:type="spellStart"/>
+      <w:r>
+        <w:rPr>
+          <w:sz w:val="20"/>
+          <w:szCs w:val="20"/>
+        </w:rPr>
+        <w:t>courseId</w:t>
+      </w:r>
+      <w:proofErr w:type="spellEnd"/>
+      <w:r>
+        <w:rPr>
+          <w:sz w:val="20"/>
+          <w:szCs w:val="20"/>
+        </w:rPr>
+        <w:t>}</w:t>
       </w:r>
     </w:p>
     <w:tbl>
@@ -66,7 +82,6 @@
         <w:tc>
           <w:tcPr>
             <w:tcW w:w="2521" w:type="dxa"/>
-            <w:shd w:val="clear" w:color="auto" w:fill="auto"/>
           </w:tcPr>
           <w:p>
             <w:pPr>
@@ -98,28 +113,42 @@
         <w:tc>
           <w:tcPr>
             <w:tcW w:w="2549" w:type="dxa"/>
-            <w:shd w:val="clear" w:color="auto" w:fill="auto"/>
-          </w:tcPr>
-          <w:p>
-            <w:pPr>
-              <w:rPr>
-                <w:sz w:val="20"/>
-                <w:szCs w:val="20"/>
-              </w:rPr>
-            </w:pPr>
-            <w:r>
-              <w:rPr>
-                <w:sz w:val="20"/>
-                <w:szCs w:val="20"/>
-              </w:rPr>
-              <w:t>${eventInstructors}</w:t>
+          </w:tcPr>
+          <w:p>
+            <w:pPr>
+              <w:rPr>
+                <w:sz w:val="20"/>
+                <w:szCs w:val="20"/>
+              </w:rPr>
+            </w:pPr>
+            <w:r>
+              <w:rPr>
+                <w:sz w:val="20"/>
+                <w:szCs w:val="20"/>
+              </w:rPr>
+              <w:t>${</w:t>
+            </w:r>
+            <w:proofErr w:type="spellStart"/>
+            <w:r>
+              <w:rPr>
+                <w:sz w:val="20"/>
+                <w:szCs w:val="20"/>
+              </w:rPr>
+              <w:t>eventInstructors</w:t>
+            </w:r>
+            <w:proofErr w:type="spellEnd"/>
+            <w:r>
+              <w:rPr>
+                <w:sz w:val="20"/>
+                <w:szCs w:val="20"/>
+              </w:rPr>
+              <w:t>}</w:t>
             </w:r>
           </w:p>
         </w:tc>
         <w:tc>
           <w:tcPr>
             <w:tcW w:w="1417" w:type="dxa"/>
-            <w:shd w:val="clear" w:color="auto" w:fill="auto"/>
           </w:tcPr>
           <w:p>
             <w:pPr>
@@ -143,7 +172,6 @@
         <w:tc>
           <w:tcPr>
             <w:tcW w:w="3260" w:type="dxa"/>
-            <w:shd w:val="clear" w:color="auto" w:fill="auto"/>
           </w:tcPr>
           <w:p>
             <w:pPr>
@@ -158,14 +186,29 @@
                 <w:sz w:val="20"/>
                 <w:szCs w:val="20"/>
               </w:rPr>
-              <w:t>${eventTechDifficulties}</w:t>
+              <w:t>${</w:t>
+            </w:r>
+            <w:proofErr w:type="spellStart"/>
+            <w:r>
+              <w:rPr>
+                <w:sz w:val="20"/>
+                <w:szCs w:val="20"/>
+              </w:rPr>
+              <w:t>eventTechDifficulties</w:t>
+            </w:r>
+            <w:proofErr w:type="spellEnd"/>
+            <w:r>
+              <w:rPr>
+                <w:sz w:val="20"/>
+                <w:szCs w:val="20"/>
+              </w:rPr>
+              <w:t>}</w:t>
             </w:r>
           </w:p>
         </w:tc>
         <w:tc>
           <w:tcPr>
             <w:tcW w:w="1568" w:type="dxa"/>
-            <w:shd w:val="clear" w:color="auto" w:fill="auto"/>
           </w:tcPr>
           <w:p>
             <w:pPr>
@@ -189,7 +232,6 @@
         <w:tc>
           <w:tcPr>
             <w:tcW w:w="4288" w:type="dxa"/>
-            <w:shd w:val="clear" w:color="auto" w:fill="auto"/>
           </w:tcPr>
           <w:p>
             <w:pPr>
@@ -213,7 +255,6 @@
         <w:tc>
           <w:tcPr>
             <w:tcW w:w="2521" w:type="dxa"/>
-            <w:shd w:val="clear" w:color="auto" w:fill="auto"/>
           </w:tcPr>
           <w:p>
             <w:pPr>
@@ -245,21 +286,36 @@
         <w:tc>
           <w:tcPr>
             <w:tcW w:w="2549" w:type="dxa"/>
-            <w:shd w:val="clear" w:color="auto" w:fill="auto"/>
-          </w:tcPr>
-          <w:p>
-            <w:pPr>
-              <w:rPr>
-                <w:sz w:val="20"/>
-                <w:szCs w:val="20"/>
-              </w:rPr>
-            </w:pPr>
-            <w:r>
-              <w:rPr>
-                <w:sz w:val="20"/>
-                <w:szCs w:val="20"/>
-              </w:rPr>
-              <w:t>${eventTitle}</w:t>
+          </w:tcPr>
+          <w:p>
+            <w:pPr>
+              <w:rPr>
+                <w:sz w:val="20"/>
+                <w:szCs w:val="20"/>
+              </w:rPr>
+            </w:pPr>
+            <w:r>
+              <w:rPr>
+                <w:sz w:val="20"/>
+                <w:szCs w:val="20"/>
+              </w:rPr>
+              <w:t>${</w:t>
+            </w:r>
+            <w:proofErr w:type="spellStart"/>
+            <w:r>
+              <w:rPr>
+                <w:sz w:val="20"/>
+                <w:szCs w:val="20"/>
+              </w:rPr>
+              <w:t>eventTitle</w:t>
+            </w:r>
+            <w:proofErr w:type="spellEnd"/>
+            <w:r>
+              <w:rPr>
+                <w:sz w:val="20"/>
+                <w:szCs w:val="20"/>
+              </w:rPr>
+              <w:t>}</w:t>
             </w:r>
           </w:p>
         </w:tc>
@@ -267,7 +323,6 @@
           <w:tcPr>
             <w:tcW w:w="1417" w:type="dxa"/>
             <w:vMerge w:val="restart"/>
-            <w:shd w:val="clear" w:color="auto" w:fill="auto"/>
           </w:tcPr>
           <w:p>
             <w:pPr>
@@ -292,7 +347,6 @@
           <w:tcPr>
             <w:tcW w:w="3260" w:type="dxa"/>
             <w:vMerge w:val="restart"/>
-            <w:shd w:val="clear" w:color="auto" w:fill="auto"/>
           </w:tcPr>
           <w:p>
             <w:pPr>
@@ -307,14 +361,29 @@
                 <w:sz w:val="20"/>
                 <w:szCs w:val="20"/>
               </w:rPr>
-              <w:t>${eventTourProfile}</w:t>
+              <w:t>${</w:t>
+            </w:r>
+            <w:proofErr w:type="spellStart"/>
+            <w:r>
+              <w:rPr>
+                <w:sz w:val="20"/>
+                <w:szCs w:val="20"/>
+              </w:rPr>
+              <w:t>eventTourProfile</w:t>
+            </w:r>
+            <w:proofErr w:type="spellEnd"/>
+            <w:r>
+              <w:rPr>
+                <w:sz w:val="20"/>
+                <w:szCs w:val="20"/>
+              </w:rPr>
+              <w:t>}</w:t>
             </w:r>
           </w:p>
         </w:tc>
         <w:tc>
           <w:tcPr>
             <w:tcW w:w="1568" w:type="dxa"/>
-            <w:shd w:val="clear" w:color="auto" w:fill="auto"/>
           </w:tcPr>
           <w:p>
             <w:pPr>
@@ -338,7 +407,6 @@
         <w:tc>
           <w:tcPr>
             <w:tcW w:w="4288" w:type="dxa"/>
-            <w:shd w:val="clear" w:color="auto" w:fill="auto"/>
           </w:tcPr>
           <w:p>
             <w:pPr>
@@ -362,7 +430,6 @@
         <w:tc>
           <w:tcPr>
             <w:tcW w:w="2521" w:type="dxa"/>
-            <w:shd w:val="clear" w:color="auto" w:fill="auto"/>
           </w:tcPr>
           <w:p>
             <w:pPr>
@@ -386,21 +453,36 @@
         <w:tc>
           <w:tcPr>
             <w:tcW w:w="2549" w:type="dxa"/>
-            <w:shd w:val="clear" w:color="auto" w:fill="auto"/>
-          </w:tcPr>
-          <w:p>
-            <w:pPr>
-              <w:rPr>
-                <w:sz w:val="20"/>
-                <w:szCs w:val="20"/>
-              </w:rPr>
-            </w:pPr>
-            <w:r>
-              <w:rPr>
-                <w:sz w:val="20"/>
-                <w:szCs w:val="20"/>
-              </w:rPr>
-              <w:t>${eventDates}</w:t>
+          </w:tcPr>
+          <w:p>
+            <w:pPr>
+              <w:rPr>
+                <w:sz w:val="20"/>
+                <w:szCs w:val="20"/>
+              </w:rPr>
+            </w:pPr>
+            <w:r>
+              <w:rPr>
+                <w:sz w:val="20"/>
+                <w:szCs w:val="20"/>
+              </w:rPr>
+              <w:t>${</w:t>
+            </w:r>
+            <w:proofErr w:type="spellStart"/>
+            <w:r>
+              <w:rPr>
+                <w:sz w:val="20"/>
+                <w:szCs w:val="20"/>
+              </w:rPr>
+              <w:t>eventDates</w:t>
+            </w:r>
+            <w:proofErr w:type="spellEnd"/>
+            <w:r>
+              <w:rPr>
+                <w:sz w:val="20"/>
+                <w:szCs w:val="20"/>
+              </w:rPr>
+              <w:t>}</w:t>
             </w:r>
           </w:p>
         </w:tc>
@@ -408,7 +490,6 @@
           <w:tcPr>
             <w:tcW w:w="1417" w:type="dxa"/>
             <w:vMerge/>
-            <w:shd w:val="clear" w:color="auto" w:fill="auto"/>
           </w:tcPr>
           <w:p>
             <w:pPr>
@@ -425,7 +506,6 @@
           <w:tcPr>
             <w:tcW w:w="3260" w:type="dxa"/>
             <w:vMerge/>
-            <w:shd w:val="clear" w:color="auto" w:fill="auto"/>
           </w:tcPr>
           <w:p>
             <w:pPr>
@@ -440,7 +520,6 @@
         <w:tc>
           <w:tcPr>
             <w:tcW w:w="1568" w:type="dxa"/>
-            <w:shd w:val="clear" w:color="auto" w:fill="auto"/>
           </w:tcPr>
           <w:p>
             <w:pPr>
@@ -464,22 +543,37 @@
         <w:tc>
           <w:tcPr>
             <w:tcW w:w="4288" w:type="dxa"/>
-            <w:shd w:val="clear" w:color="auto" w:fill="auto"/>
-          </w:tcPr>
-          <w:p>
-            <w:pPr>
-              <w:rPr>
-                <w:b/>
-                <w:sz w:val="20"/>
-                <w:szCs w:val="20"/>
-              </w:rPr>
-            </w:pPr>
-            <w:r>
-              <w:rPr>
-                <w:sz w:val="20"/>
-                <w:szCs w:val="20"/>
-              </w:rPr>
-              <w:t>${eventMiscellaneous}</w:t>
+          </w:tcPr>
+          <w:p>
+            <w:pPr>
+              <w:rPr>
+                <w:b/>
+                <w:sz w:val="20"/>
+                <w:szCs w:val="20"/>
+              </w:rPr>
+            </w:pPr>
+            <w:r>
+              <w:rPr>
+                <w:sz w:val="20"/>
+                <w:szCs w:val="20"/>
+              </w:rPr>
+              <w:t>${</w:t>
+            </w:r>
+            <w:proofErr w:type="spellStart"/>
+            <w:r>
+              <w:rPr>
+                <w:sz w:val="20"/>
+                <w:szCs w:val="20"/>
+              </w:rPr>
+              <w:t>eventMiscellaneous</w:t>
+            </w:r>
+            <w:proofErr w:type="spellEnd"/>
+            <w:r>
+              <w:rPr>
+                <w:sz w:val="20"/>
+                <w:szCs w:val="20"/>
+              </w:rPr>
+              <w:t>}</w:t>
             </w:r>
           </w:p>
         </w:tc>
@@ -488,7 +582,6 @@
         <w:tc>
           <w:tcPr>
             <w:tcW w:w="2521" w:type="dxa"/>
-            <w:shd w:val="clear" w:color="auto" w:fill="auto"/>
           </w:tcPr>
           <w:p>
             <w:pPr>
@@ -512,7 +605,6 @@
         <w:tc>
           <w:tcPr>
             <w:tcW w:w="2549" w:type="dxa"/>
-            <w:shd w:val="clear" w:color="auto" w:fill="auto"/>
           </w:tcPr>
           <w:p>
             <w:pPr>
@@ -528,6 +620,7 @@
               </w:rPr>
               <w:t>${</w:t>
             </w:r>
+            <w:proofErr w:type="spellStart"/>
             <w:r>
               <w:rPr>
                 <w:sz w:val="20"/>
@@ -540,7 +633,15 @@
                 <w:sz w:val="20"/>
                 <w:szCs w:val="20"/>
               </w:rPr>
-              <w:t>eetingpoint}</w:t>
+              <w:t>eetingpoint</w:t>
+            </w:r>
+            <w:proofErr w:type="spellEnd"/>
+            <w:r>
+              <w:rPr>
+                <w:sz w:val="20"/>
+                <w:szCs w:val="20"/>
+              </w:rPr>
+              <w:t>}</w:t>
             </w:r>
           </w:p>
         </w:tc>
@@ -548,7 +649,6 @@
           <w:tcPr>
             <w:tcW w:w="1417" w:type="dxa"/>
             <w:vMerge/>
-            <w:shd w:val="clear" w:color="auto" w:fill="auto"/>
           </w:tcPr>
           <w:p>
             <w:pPr>
@@ -565,7 +665,6 @@
           <w:tcPr>
             <w:tcW w:w="3260" w:type="dxa"/>
             <w:vMerge/>
-            <w:shd w:val="clear" w:color="auto" w:fill="auto"/>
           </w:tcPr>
           <w:p>
             <w:pPr>
@@ -580,7 +679,6 @@
         <w:tc>
           <w:tcPr>
             <w:tcW w:w="1568" w:type="dxa"/>
-            <w:shd w:val="clear" w:color="auto" w:fill="auto"/>
           </w:tcPr>
           <w:p>
             <w:pPr>
@@ -604,21 +702,36 @@
         <w:tc>
           <w:tcPr>
             <w:tcW w:w="4288" w:type="dxa"/>
-            <w:shd w:val="clear" w:color="auto" w:fill="auto"/>
-          </w:tcPr>
-          <w:p>
-            <w:pPr>
-              <w:rPr>
-                <w:sz w:val="20"/>
-                <w:szCs w:val="20"/>
-              </w:rPr>
-            </w:pPr>
-            <w:r>
-              <w:rPr>
-                <w:sz w:val="20"/>
-                <w:szCs w:val="20"/>
-              </w:rPr>
-              <w:t>${eventEquipment}</w:t>
+          </w:tcPr>
+          <w:p>
+            <w:pPr>
+              <w:rPr>
+                <w:sz w:val="20"/>
+                <w:szCs w:val="20"/>
+              </w:rPr>
+            </w:pPr>
+            <w:r>
+              <w:rPr>
+                <w:sz w:val="20"/>
+                <w:szCs w:val="20"/>
+              </w:rPr>
+              <w:t>${</w:t>
+            </w:r>
+            <w:proofErr w:type="spellStart"/>
+            <w:r>
+              <w:rPr>
+                <w:sz w:val="20"/>
+                <w:szCs w:val="20"/>
+              </w:rPr>
+              <w:t>eventEquipment</w:t>
+            </w:r>
+            <w:proofErr w:type="spellEnd"/>
+            <w:r>
+              <w:rPr>
+                <w:sz w:val="20"/>
+                <w:szCs w:val="20"/>
+              </w:rPr>
+              <w:t>}</w:t>
             </w:r>
           </w:p>
         </w:tc>
@@ -658,7 +771,6 @@
         <w:tc>
           <w:tcPr>
             <w:tcW w:w="519" w:type="dxa"/>
-            <w:shd w:val="clear" w:color="auto" w:fill="auto"/>
             <w:vAlign w:val="center"/>
           </w:tcPr>
           <w:p>
@@ -696,7 +808,6 @@
         <w:tc>
           <w:tcPr>
             <w:tcW w:w="4921" w:type="dxa"/>
-            <w:shd w:val="clear" w:color="auto" w:fill="auto"/>
             <w:vAlign w:val="center"/>
           </w:tcPr>
           <w:p>
@@ -705,13 +816,15 @@
                 <w:b/>
                 <w:sz w:val="20"/>
                 <w:szCs w:val="20"/>
-              </w:rPr>
-            </w:pPr>
-            <w:r>
-              <w:rPr>
-                <w:b/>
-                <w:sz w:val="20"/>
-                <w:szCs w:val="20"/>
+                <w:lang w:val="en-GB"/>
+              </w:rPr>
+            </w:pPr>
+            <w:r>
+              <w:rPr>
+                <w:b/>
+                <w:sz w:val="20"/>
+                <w:szCs w:val="20"/>
+                <w:lang w:val="en-GB"/>
               </w:rPr>
               <w:t>Name, E-Mail,</w:t>
             </w:r>
@@ -720,22 +833,36 @@
                 <w:b/>
                 <w:sz w:val="20"/>
                 <w:szCs w:val="20"/>
-              </w:rPr>
-              <w:t xml:space="preserve"> Mitgl. N</w:t>
-            </w:r>
-            <w:r>
-              <w:rPr>
-                <w:b/>
-                <w:sz w:val="20"/>
-                <w:szCs w:val="20"/>
-              </w:rPr>
-              <w:t>o.</w:t>
-            </w:r>
-            <w:r>
-              <w:rPr>
-                <w:b/>
-                <w:sz w:val="20"/>
-                <w:szCs w:val="20"/>
+                <w:lang w:val="en-GB"/>
+              </w:rPr>
+              <w:t xml:space="preserve"> </w:t>
+            </w:r>
+            <w:proofErr w:type="spellStart"/>
+            <w:r>
+              <w:rPr>
+                <w:b/>
+                <w:sz w:val="20"/>
+                <w:szCs w:val="20"/>
+                <w:lang w:val="en-GB"/>
+              </w:rPr>
+              <w:t>Mitgl</w:t>
+            </w:r>
+            <w:proofErr w:type="spellEnd"/>
+            <w:r>
+              <w:rPr>
+                <w:b/>
+                <w:sz w:val="20"/>
+                <w:szCs w:val="20"/>
+                <w:lang w:val="en-GB"/>
+              </w:rPr>
+              <w:t>. No.</w:t>
+            </w:r>
+            <w:r>
+              <w:rPr>
+                <w:b/>
+                <w:sz w:val="20"/>
+                <w:szCs w:val="20"/>
+                <w:lang w:val="en-GB"/>
               </w:rPr>
               <w:t xml:space="preserve"> &amp; Transport</w:t>
             </w:r>
@@ -744,7 +871,6 @@
         <w:tc>
           <w:tcPr>
             <w:tcW w:w="2693" w:type="dxa"/>
-            <w:shd w:val="clear" w:color="auto" w:fill="auto"/>
             <w:vAlign w:val="center"/>
           </w:tcPr>
           <w:p>
@@ -768,7 +894,6 @@
         <w:tc>
           <w:tcPr>
             <w:tcW w:w="4252" w:type="dxa"/>
-            <w:shd w:val="clear" w:color="auto" w:fill="auto"/>
             <w:vAlign w:val="center"/>
           </w:tcPr>
           <w:p>
@@ -792,7 +917,6 @@
         <w:tc>
           <w:tcPr>
             <w:tcW w:w="2410" w:type="dxa"/>
-            <w:shd w:val="clear" w:color="auto" w:fill="auto"/>
             <w:vAlign w:val="center"/>
           </w:tcPr>
           <w:p>
@@ -821,7 +945,6 @@
         <w:tc>
           <w:tcPr>
             <w:tcW w:w="519" w:type="dxa"/>
-            <w:shd w:val="clear" w:color="auto" w:fill="auto"/>
           </w:tcPr>
           <w:p>
             <w:pPr>
@@ -857,6 +980,7 @@
               </w:rPr>
               <w:t>${</w:t>
             </w:r>
+            <w:proofErr w:type="spellStart"/>
             <w:r>
               <w:rPr>
                 <w:sz w:val="20"/>
@@ -864,6 +988,7 @@
               </w:rPr>
               <w:t>role</w:t>
             </w:r>
+            <w:proofErr w:type="spellEnd"/>
             <w:r>
               <w:rPr>
                 <w:sz w:val="20"/>
@@ -876,7 +1001,6 @@
         <w:tc>
           <w:tcPr>
             <w:tcW w:w="4921" w:type="dxa"/>
-            <w:shd w:val="clear" w:color="auto" w:fill="auto"/>
           </w:tcPr>
           <w:p>
             <w:pPr>
@@ -891,7 +1015,23 @@
                 <w:sz w:val="20"/>
                 <w:szCs w:val="20"/>
               </w:rPr>
-              <w:t>${lastname}</w:t>
+              <w:t>${</w:t>
+            </w:r>
+            <w:proofErr w:type="spellStart"/>
+            <w:r>
+              <w:rPr>
+                <w:sz w:val="20"/>
+                <w:szCs w:val="20"/>
+              </w:rPr>
+              <w:t>lastname</w:t>
+            </w:r>
+            <w:proofErr w:type="spellEnd"/>
+            <w:r>
+              <w:rPr>
+                <w:sz w:val="20"/>
+                <w:szCs w:val="20"/>
+              </w:rPr>
+              <w:t>}</w:t>
             </w:r>
             <w:r>
               <w:rPr>
@@ -905,7 +1045,23 @@
                 <w:sz w:val="20"/>
                 <w:szCs w:val="20"/>
               </w:rPr>
-              <w:t>${firstname}</w:t>
+              <w:t>${</w:t>
+            </w:r>
+            <w:proofErr w:type="spellStart"/>
+            <w:r>
+              <w:rPr>
+                <w:sz w:val="20"/>
+                <w:szCs w:val="20"/>
+              </w:rPr>
+              <w:t>firstname</w:t>
+            </w:r>
+            <w:proofErr w:type="spellEnd"/>
+            <w:r>
+              <w:rPr>
+                <w:sz w:val="20"/>
+                <w:szCs w:val="20"/>
+              </w:rPr>
+              <w:t>}</w:t>
             </w:r>
             <w:r>
               <w:rPr>
@@ -913,7 +1069,23 @@
                 <w:szCs w:val="20"/>
               </w:rPr>
               <w:br/>
-              <w:t>${sacMemberId}</w:t>
+              <w:t>${</w:t>
+            </w:r>
+            <w:proofErr w:type="spellStart"/>
+            <w:r>
+              <w:rPr>
+                <w:sz w:val="20"/>
+                <w:szCs w:val="20"/>
+              </w:rPr>
+              <w:t>sacMemberId</w:t>
+            </w:r>
+            <w:proofErr w:type="spellEnd"/>
+            <w:r>
+              <w:rPr>
+                <w:sz w:val="20"/>
+                <w:szCs w:val="20"/>
+              </w:rPr>
+              <w:t>}</w:t>
             </w:r>
             <w:r>
               <w:rPr>
@@ -927,7 +1099,23 @@
                 <w:sz w:val="20"/>
                 <w:szCs w:val="20"/>
               </w:rPr>
-              <w:t xml:space="preserve">${memberInSection} </w:t>
+              <w:t>${</w:t>
+            </w:r>
+            <w:proofErr w:type="spellStart"/>
+            <w:r>
+              <w:rPr>
+                <w:sz w:val="20"/>
+                <w:szCs w:val="20"/>
+              </w:rPr>
+              <w:t>memberInSection</w:t>
+            </w:r>
+            <w:proofErr w:type="spellEnd"/>
+            <w:r>
+              <w:rPr>
+                <w:sz w:val="20"/>
+                <w:szCs w:val="20"/>
+              </w:rPr>
+              <w:t xml:space="preserve">} </w:t>
             </w:r>
             <w:r>
               <w:rPr>
@@ -938,6 +1126,7 @@
               </w:rPr>
               <w:t>${</w:t>
             </w:r>
+            <w:proofErr w:type="spellStart"/>
             <w:r>
               <w:rPr>
                 <w:b/>
@@ -972,8 +1161,9 @@
                 <w:sz w:val="20"/>
                 <w:szCs w:val="20"/>
               </w:rPr>
-              <w:t>Member}</w:t>
-            </w:r>
+              <w:t>Member</w:t>
+            </w:r>
+            <w:proofErr w:type="spellEnd"/>
             <w:r>
               <w:rPr>
                 <w:b/>
@@ -981,6 +1171,15 @@
                 <w:sz w:val="20"/>
                 <w:szCs w:val="20"/>
               </w:rPr>
+              <w:t>}</w:t>
+            </w:r>
+            <w:r>
+              <w:rPr>
+                <w:b/>
+                <w:color w:val="FF0000"/>
+                <w:sz w:val="20"/>
+                <w:szCs w:val="20"/>
+              </w:rPr>
               <w:br/>
             </w:r>
             <w:r>
@@ -988,7 +1187,23 @@
                 <w:sz w:val="20"/>
                 <w:szCs w:val="20"/>
               </w:rPr>
-              <w:t>${email}</w:t>
+              <w:t>${</w:t>
+            </w:r>
+            <w:proofErr w:type="gramStart"/>
+            <w:r>
+              <w:rPr>
+                <w:sz w:val="20"/>
+                <w:szCs w:val="20"/>
+              </w:rPr>
+              <w:t>email</w:t>
+            </w:r>
+            <w:proofErr w:type="gramEnd"/>
+            <w:r>
+              <w:rPr>
+                <w:sz w:val="20"/>
+                <w:szCs w:val="20"/>
+              </w:rPr>
+              <w:t>}</w:t>
             </w:r>
             <w:r>
               <w:rPr>
@@ -1005,34 +1220,59 @@
               </w:rPr>
               <w:t>${</w:t>
             </w:r>
+            <w:proofErr w:type="spellStart"/>
             <w:r>
               <w:rPr>
                 <w:color w:val="00B050"/>
                 <w:sz w:val="20"/>
                 <w:szCs w:val="20"/>
               </w:rPr>
-              <w:t>transportInfo}</w:t>
+              <w:t>transportInfo</w:t>
+            </w:r>
+            <w:proofErr w:type="spellEnd"/>
+            <w:r>
+              <w:rPr>
+                <w:color w:val="00B050"/>
+                <w:sz w:val="20"/>
+                <w:szCs w:val="20"/>
+              </w:rPr>
+              <w:t>}</w:t>
             </w:r>
           </w:p>
         </w:tc>
         <w:tc>
           <w:tcPr>
             <w:tcW w:w="2693" w:type="dxa"/>
-            <w:shd w:val="clear" w:color="auto" w:fill="auto"/>
-          </w:tcPr>
-          <w:p>
-            <w:pPr>
-              <w:rPr>
-                <w:sz w:val="20"/>
-                <w:szCs w:val="20"/>
-              </w:rPr>
-            </w:pPr>
-            <w:r>
-              <w:rPr>
-                <w:sz w:val="20"/>
-                <w:szCs w:val="20"/>
-              </w:rPr>
-              <w:t>${street}</w:t>
+          </w:tcPr>
+          <w:p>
+            <w:pPr>
+              <w:rPr>
+                <w:sz w:val="20"/>
+                <w:szCs w:val="20"/>
+              </w:rPr>
+            </w:pPr>
+            <w:r>
+              <w:rPr>
+                <w:sz w:val="20"/>
+                <w:szCs w:val="20"/>
+              </w:rPr>
+              <w:t>${</w:t>
+            </w:r>
+            <w:proofErr w:type="spellStart"/>
+            <w:r>
+              <w:rPr>
+                <w:sz w:val="20"/>
+                <w:szCs w:val="20"/>
+              </w:rPr>
+              <w:t>street</w:t>
+            </w:r>
+            <w:proofErr w:type="spellEnd"/>
+            <w:r>
+              <w:rPr>
+                <w:sz w:val="20"/>
+                <w:szCs w:val="20"/>
+              </w:rPr>
+              <w:t>}</w:t>
             </w:r>
             <w:r>
               <w:rPr>
@@ -1040,7 +1280,23 @@
                 <w:szCs w:val="20"/>
               </w:rPr>
               <w:br/>
-              <w:t>${postal} ${city}</w:t>
+              <w:t>${postal} ${</w:t>
+            </w:r>
+            <w:proofErr w:type="spellStart"/>
+            <w:r>
+              <w:rPr>
+                <w:sz w:val="20"/>
+                <w:szCs w:val="20"/>
+              </w:rPr>
+              <w:t>city</w:t>
+            </w:r>
+            <w:proofErr w:type="spellEnd"/>
+            <w:r>
+              <w:rPr>
+                <w:sz w:val="20"/>
+                <w:szCs w:val="20"/>
+              </w:rPr>
+              <w:t>}</w:t>
             </w:r>
             <w:r>
               <w:rPr>
@@ -1054,7 +1310,6 @@
         <w:tc>
           <w:tcPr>
             <w:tcW w:w="4252" w:type="dxa"/>
-            <w:shd w:val="clear" w:color="auto" w:fill="auto"/>
           </w:tcPr>
           <w:p>
             <w:pPr>
@@ -1070,6 +1325,7 @@
               </w:rPr>
               <w:t>${</w:t>
             </w:r>
+            <w:proofErr w:type="spellStart"/>
             <w:r>
               <w:rPr>
                 <w:sz w:val="20"/>
@@ -1077,6 +1333,7 @@
               </w:rPr>
               <w:t>phone</w:t>
             </w:r>
+            <w:proofErr w:type="spellEnd"/>
             <w:r>
               <w:rPr>
                 <w:sz w:val="20"/>
@@ -1105,6 +1362,7 @@
               </w:rPr>
               <w:t>${</w:t>
             </w:r>
+            <w:proofErr w:type="spellStart"/>
             <w:r>
               <w:rPr>
                 <w:sz w:val="20"/>
@@ -1112,6 +1370,7 @@
               </w:rPr>
               <w:t>emergencyPhoneName</w:t>
             </w:r>
+            <w:proofErr w:type="spellEnd"/>
             <w:r>
               <w:rPr>
                 <w:sz w:val="20"/>
@@ -1134,6 +1393,7 @@
               </w:rPr>
               <w:t>${</w:t>
             </w:r>
+            <w:proofErr w:type="spellStart"/>
             <w:r>
               <w:rPr>
                 <w:sz w:val="20"/>
@@ -1141,6 +1401,7 @@
               </w:rPr>
               <w:t>emergencyPhone</w:t>
             </w:r>
+            <w:proofErr w:type="spellEnd"/>
             <w:r>
               <w:rPr>
                 <w:sz w:val="20"/>
@@ -1153,15 +1414,40 @@
         <w:tc>
           <w:tcPr>
             <w:tcW w:w="2410" w:type="dxa"/>
-            <w:shd w:val="clear" w:color="auto" w:fill="auto"/>
-          </w:tcPr>
-          <w:p>
-            <w:pPr>
-              <w:rPr>
-                <w:sz w:val="20"/>
-                <w:szCs w:val="20"/>
-              </w:rPr>
-            </w:pPr>
+          </w:tcPr>
+          <w:p>
+            <w:pPr>
+              <w:rPr>
+                <w:sz w:val="20"/>
+                <w:szCs w:val="20"/>
+              </w:rPr>
+            </w:pPr>
+            <w:r>
+              <w:rPr>
+                <w:color w:val="767171" w:themeColor="background2" w:themeShade="80"/>
+                <w:sz w:val="20"/>
+                <w:szCs w:val="20"/>
+              </w:rPr>
+              <w:t>${</w:t>
+            </w:r>
+            <w:proofErr w:type="spellStart"/>
+            <w:r>
+              <w:rPr>
+                <w:color w:val="767171" w:themeColor="background2" w:themeShade="80"/>
+                <w:sz w:val="20"/>
+                <w:szCs w:val="20"/>
+              </w:rPr>
+              <w:t>remarks</w:t>
+            </w:r>
+            <w:proofErr w:type="spellEnd"/>
+            <w:r>
+              <w:rPr>
+                <w:color w:val="767171" w:themeColor="background2" w:themeShade="80"/>
+                <w:sz w:val="20"/>
+                <w:szCs w:val="20"/>
+              </w:rPr>
+              <w:t>}</w:t>
+            </w:r>
           </w:p>
         </w:tc>
       </w:tr>
@@ -1187,7 +1473,6 @@
         <w:tc>
           <w:tcPr>
             <w:tcW w:w="4361" w:type="dxa"/>
-            <w:shd w:val="clear" w:color="auto" w:fill="auto"/>
           </w:tcPr>
           <w:p>
             <w:pPr>
@@ -1225,21 +1510,36 @@
         <w:tc>
           <w:tcPr>
             <w:tcW w:w="11199" w:type="dxa"/>
-            <w:shd w:val="clear" w:color="auto" w:fill="auto"/>
-          </w:tcPr>
-          <w:p>
-            <w:pPr>
-              <w:rPr>
-                <w:sz w:val="20"/>
-                <w:szCs w:val="20"/>
-              </w:rPr>
-            </w:pPr>
-            <w:r>
-              <w:rPr>
-                <w:sz w:val="20"/>
-                <w:szCs w:val="20"/>
-              </w:rPr>
-              <w:t>${emergencyConcept}</w:t>
+          </w:tcPr>
+          <w:p>
+            <w:pPr>
+              <w:rPr>
+                <w:sz w:val="20"/>
+                <w:szCs w:val="20"/>
+              </w:rPr>
+            </w:pPr>
+            <w:r>
+              <w:rPr>
+                <w:sz w:val="20"/>
+                <w:szCs w:val="20"/>
+              </w:rPr>
+              <w:t>${</w:t>
+            </w:r>
+            <w:proofErr w:type="spellStart"/>
+            <w:r>
+              <w:rPr>
+                <w:sz w:val="20"/>
+                <w:szCs w:val="20"/>
+              </w:rPr>
+              <w:t>emergencyConcept</w:t>
+            </w:r>
+            <w:proofErr w:type="spellEnd"/>
+            <w:r>
+              <w:rPr>
+                <w:sz w:val="20"/>
+                <w:szCs w:val="20"/>
+              </w:rPr>
+              <w:t>}</w:t>
             </w:r>
           </w:p>
         </w:tc>
@@ -1264,7 +1564,15 @@
           <w:sz w:val="20"/>
           <w:szCs w:val="20"/>
         </w:rPr>
-        <w:t>${event</w:t>
+        <w:t>${</w:t>
+      </w:r>
+      <w:proofErr w:type="spellStart"/>
+      <w:r>
+        <w:rPr>
+          <w:sz w:val="20"/>
+          <w:szCs w:val="20"/>
+        </w:rPr>
+        <w:t>event</w:t>
       </w:r>
       <w:r>
         <w:rPr>
@@ -1273,6 +1581,7 @@
         </w:rPr>
         <w:t>Id</w:t>
       </w:r>
+      <w:proofErr w:type="spellEnd"/>
       <w:r>
         <w:rPr>
           <w:sz w:val="20"/>

</xml_diff>

<commit_message>
Add the age group tp the event registration lists
Fix: https://github.com/jonasmueller1/sac-pilatus-website/issues/202
</commit_message>
<xml_diff>
--- a/contao/templates/docx/event_memberlist.docx
+++ b/contao/templates/docx/event_memberlist.docx
@@ -1068,7 +1068,47 @@
                 <w:sz w:val="20"/>
                 <w:szCs w:val="20"/>
               </w:rPr>
+              <w:t xml:space="preserve"> </w:t>
+            </w:r>
+            <w:r>
+              <w:rPr>
+                <w:color w:val="00B050"/>
+                <w:sz w:val="20"/>
+                <w:szCs w:val="20"/>
+              </w:rPr>
+              <w:t>${</w:t>
+            </w:r>
+            <w:proofErr w:type="spellStart"/>
+            <w:r>
+              <w:rPr>
+                <w:color w:val="00B050"/>
+                <w:sz w:val="20"/>
+                <w:szCs w:val="20"/>
+              </w:rPr>
+              <w:t>ageInfo</w:t>
+            </w:r>
+            <w:proofErr w:type="spellEnd"/>
+            <w:r>
+              <w:rPr>
+                <w:color w:val="00B050"/>
+                <w:sz w:val="20"/>
+                <w:szCs w:val="20"/>
+              </w:rPr>
+              <w:t>}</w:t>
+            </w:r>
+            <w:r>
+              <w:rPr>
+                <w:color w:val="D0CECE" w:themeColor="background2" w:themeShade="E6"/>
+                <w:sz w:val="20"/>
+                <w:szCs w:val="20"/>
+              </w:rPr>
               <w:br/>
+            </w:r>
+            <w:r>
+              <w:rPr>
+                <w:sz w:val="20"/>
+                <w:szCs w:val="20"/>
+              </w:rPr>
               <w:t>${</w:t>
             </w:r>
             <w:proofErr w:type="spellStart"/>

</xml_diff>

<commit_message>
Add the Min- and max Teilnehmerzahl to the PDF Teilnehmerliste See: https://github.com/jonasmueller1/sac-pilatus-website/issues/211#issuecomment-3499347095
</commit_message>
<xml_diff>
--- a/contao/templates/docx/event_memberlist.docx
+++ b/contao/templates/docx/event_memberlist.docx
@@ -61,22 +61,22 @@
       <w:tblPr>
         <w:tblW w:w="0" w:type="auto"/>
         <w:tblBorders>
-          <w:top w:val="single" w:sz="4" w:space="0" w:color="auto"/>
-          <w:left w:val="single" w:sz="4" w:space="0" w:color="auto"/>
-          <w:bottom w:val="single" w:sz="4" w:space="0" w:color="auto"/>
-          <w:right w:val="single" w:sz="4" w:space="0" w:color="auto"/>
-          <w:insideH w:val="single" w:sz="4" w:space="0" w:color="auto"/>
-          <w:insideV w:val="single" w:sz="4" w:space="0" w:color="auto"/>
+          <w:top w:val="single" w:sz="2" w:space="0" w:color="auto"/>
+          <w:left w:val="single" w:sz="2" w:space="0" w:color="auto"/>
+          <w:bottom w:val="single" w:sz="2" w:space="0" w:color="auto"/>
+          <w:right w:val="single" w:sz="2" w:space="0" w:color="auto"/>
+          <w:insideH w:val="single" w:sz="2" w:space="0" w:color="auto"/>
+          <w:insideV w:val="single" w:sz="2" w:space="0" w:color="auto"/>
         </w:tblBorders>
         <w:tblLook w:val="04A0" w:firstRow="1" w:lastRow="0" w:firstColumn="1" w:lastColumn="0" w:noHBand="0" w:noVBand="1"/>
       </w:tblPr>
       <w:tblGrid>
-        <w:gridCol w:w="2504"/>
-        <w:gridCol w:w="2526"/>
-        <w:gridCol w:w="1413"/>
-        <w:gridCol w:w="3213"/>
-        <w:gridCol w:w="1560"/>
-        <w:gridCol w:w="4194"/>
+        <w:gridCol w:w="2459"/>
+        <w:gridCol w:w="2967"/>
+        <w:gridCol w:w="1404"/>
+        <w:gridCol w:w="3093"/>
+        <w:gridCol w:w="1539"/>
+        <w:gridCol w:w="3952"/>
       </w:tblGrid>
       <w:tr>
         <w:tc>
@@ -149,6 +149,9 @@
         <w:tc>
           <w:tcPr>
             <w:tcW w:w="1417" w:type="dxa"/>
+            <w:tcBorders>
+              <w:bottom w:val="single" w:sz="2" w:space="0" w:color="auto"/>
+            </w:tcBorders>
           </w:tcPr>
           <w:p>
             <w:pPr>
@@ -323,6 +326,9 @@
           <w:tcPr>
             <w:tcW w:w="1417" w:type="dxa"/>
             <w:vMerge w:val="restart"/>
+            <w:tcBorders>
+              <w:bottom w:val="nil"/>
+            </w:tcBorders>
           </w:tcPr>
           <w:p>
             <w:pPr>
@@ -490,6 +496,9 @@
           <w:tcPr>
             <w:tcW w:w="1417" w:type="dxa"/>
             <w:vMerge/>
+            <w:tcBorders>
+              <w:bottom w:val="nil"/>
+            </w:tcBorders>
           </w:tcPr>
           <w:p>
             <w:pPr>
@@ -649,6 +658,9 @@
           <w:tcPr>
             <w:tcW w:w="1417" w:type="dxa"/>
             <w:vMerge/>
+            <w:tcBorders>
+              <w:bottom w:val="nil"/>
+            </w:tcBorders>
           </w:tcPr>
           <w:p>
             <w:pPr>
@@ -665,6 +677,9 @@
           <w:tcPr>
             <w:tcW w:w="3260" w:type="dxa"/>
             <w:vMerge/>
+            <w:tcBorders>
+              <w:bottom w:val="nil"/>
+            </w:tcBorders>
           </w:tcPr>
           <w:p>
             <w:pPr>
@@ -679,6 +694,9 @@
         <w:tc>
           <w:tcPr>
             <w:tcW w:w="1568" w:type="dxa"/>
+            <w:tcBorders>
+              <w:bottom w:val="nil"/>
+            </w:tcBorders>
           </w:tcPr>
           <w:p>
             <w:pPr>
@@ -702,6 +720,9 @@
         <w:tc>
           <w:tcPr>
             <w:tcW w:w="4288" w:type="dxa"/>
+            <w:tcBorders>
+              <w:bottom w:val="nil"/>
+            </w:tcBorders>
           </w:tcPr>
           <w:p>
             <w:pPr>
@@ -733,6 +754,152 @@
               </w:rPr>
               <w:t>}</w:t>
             </w:r>
+          </w:p>
+        </w:tc>
+      </w:tr>
+      <w:tr>
+        <w:tc>
+          <w:tcPr>
+            <w:tcW w:w="2521" w:type="dxa"/>
+          </w:tcPr>
+          <w:p>
+            <w:pPr>
+              <w:jc w:val="right"/>
+              <w:rPr>
+                <w:b/>
+                <w:sz w:val="20"/>
+                <w:szCs w:val="20"/>
+              </w:rPr>
+            </w:pPr>
+            <w:r>
+              <w:rPr>
+                <w:b/>
+                <w:sz w:val="20"/>
+                <w:szCs w:val="20"/>
+              </w:rPr>
+              <w:t>Min. und Max. TN-Zahl</w:t>
+            </w:r>
+          </w:p>
+        </w:tc>
+        <w:tc>
+          <w:tcPr>
+            <w:tcW w:w="2549" w:type="dxa"/>
+          </w:tcPr>
+          <w:p>
+            <w:pPr>
+              <w:rPr>
+                <w:sz w:val="20"/>
+                <w:szCs w:val="20"/>
+              </w:rPr>
+            </w:pPr>
+            <w:r>
+              <w:rPr>
+                <w:sz w:val="20"/>
+                <w:szCs w:val="20"/>
+              </w:rPr>
+              <w:t>${</w:t>
+            </w:r>
+            <w:proofErr w:type="spellStart"/>
+            <w:r>
+              <w:rPr>
+                <w:sz w:val="20"/>
+                <w:szCs w:val="20"/>
+              </w:rPr>
+              <w:t>minMembers</w:t>
+            </w:r>
+            <w:proofErr w:type="spellEnd"/>
+            <w:r>
+              <w:rPr>
+                <w:sz w:val="20"/>
+                <w:szCs w:val="20"/>
+              </w:rPr>
+              <w:t>}/${</w:t>
+            </w:r>
+            <w:proofErr w:type="spellStart"/>
+            <w:r>
+              <w:rPr>
+                <w:sz w:val="20"/>
+                <w:szCs w:val="20"/>
+              </w:rPr>
+              <w:t>maxMembers</w:t>
+            </w:r>
+            <w:proofErr w:type="spellEnd"/>
+            <w:r>
+              <w:rPr>
+                <w:sz w:val="20"/>
+                <w:szCs w:val="20"/>
+              </w:rPr>
+              <w:t>}</w:t>
+            </w:r>
+          </w:p>
+        </w:tc>
+        <w:tc>
+          <w:tcPr>
+            <w:tcW w:w="1417" w:type="dxa"/>
+            <w:tcBorders>
+              <w:top w:val="nil"/>
+            </w:tcBorders>
+          </w:tcPr>
+          <w:p>
+            <w:pPr>
+              <w:jc w:val="right"/>
+              <w:rPr>
+                <w:b/>
+                <w:sz w:val="20"/>
+                <w:szCs w:val="20"/>
+              </w:rPr>
+            </w:pPr>
+          </w:p>
+        </w:tc>
+        <w:tc>
+          <w:tcPr>
+            <w:tcW w:w="3260" w:type="dxa"/>
+            <w:tcBorders>
+              <w:top w:val="nil"/>
+            </w:tcBorders>
+          </w:tcPr>
+          <w:p>
+            <w:pPr>
+              <w:jc w:val="right"/>
+              <w:rPr>
+                <w:sz w:val="20"/>
+                <w:szCs w:val="20"/>
+              </w:rPr>
+            </w:pPr>
+          </w:p>
+        </w:tc>
+        <w:tc>
+          <w:tcPr>
+            <w:tcW w:w="1568" w:type="dxa"/>
+            <w:tcBorders>
+              <w:top w:val="nil"/>
+            </w:tcBorders>
+          </w:tcPr>
+          <w:p>
+            <w:pPr>
+              <w:jc w:val="right"/>
+              <w:rPr>
+                <w:b/>
+                <w:sz w:val="20"/>
+                <w:szCs w:val="20"/>
+              </w:rPr>
+            </w:pPr>
+          </w:p>
+        </w:tc>
+        <w:tc>
+          <w:tcPr>
+            <w:tcW w:w="4288" w:type="dxa"/>
+            <w:tcBorders>
+              <w:top w:val="nil"/>
+            </w:tcBorders>
+          </w:tcPr>
+          <w:p>
+            <w:pPr>
+              <w:rPr>
+                <w:sz w:val="20"/>
+                <w:szCs w:val="20"/>
+              </w:rPr>
+            </w:pPr>
           </w:p>
         </w:tc>
       </w:tr>
@@ -750,12 +917,12 @@
       <w:tblPr>
         <w:tblW w:w="15559" w:type="dxa"/>
         <w:tblBorders>
-          <w:top w:val="single" w:sz="4" w:space="0" w:color="auto"/>
-          <w:left w:val="single" w:sz="4" w:space="0" w:color="auto"/>
-          <w:bottom w:val="single" w:sz="4" w:space="0" w:color="auto"/>
-          <w:right w:val="single" w:sz="4" w:space="0" w:color="auto"/>
-          <w:insideH w:val="single" w:sz="4" w:space="0" w:color="auto"/>
-          <w:insideV w:val="single" w:sz="4" w:space="0" w:color="auto"/>
+          <w:top w:val="single" w:sz="2" w:space="0" w:color="auto"/>
+          <w:left w:val="single" w:sz="2" w:space="0" w:color="auto"/>
+          <w:bottom w:val="single" w:sz="2" w:space="0" w:color="auto"/>
+          <w:right w:val="single" w:sz="2" w:space="0" w:color="auto"/>
+          <w:insideH w:val="single" w:sz="2" w:space="0" w:color="auto"/>
+          <w:insideV w:val="single" w:sz="2" w:space="0" w:color="auto"/>
         </w:tblBorders>
         <w:tblLook w:val="04A0" w:firstRow="1" w:lastRow="0" w:firstColumn="1" w:lastColumn="0" w:noHBand="0" w:noVBand="1"/>
       </w:tblPr>
@@ -826,8 +993,9 @@
                 <w:szCs w:val="20"/>
                 <w:lang w:val="en-GB"/>
               </w:rPr>
-              <w:t>Name, E-Mail,</w:t>
-            </w:r>
+              <w:t xml:space="preserve">Name, E-Mail, </w:t>
+            </w:r>
+            <w:proofErr w:type="spellStart"/>
             <w:r>
               <w:rPr>
                 <w:b/>
@@ -835,9 +1003,9 @@
                 <w:szCs w:val="20"/>
                 <w:lang w:val="en-GB"/>
               </w:rPr>
-              <w:t xml:space="preserve"> </w:t>
-            </w:r>
-            <w:proofErr w:type="spellStart"/>
+              <w:t>Mitgl</w:t>
+            </w:r>
+            <w:proofErr w:type="spellEnd"/>
             <w:r>
               <w:rPr>
                 <w:b/>
@@ -845,26 +1013,7 @@
                 <w:szCs w:val="20"/>
                 <w:lang w:val="en-GB"/>
               </w:rPr>
-              <w:t>Mitgl</w:t>
-            </w:r>
-            <w:proofErr w:type="spellEnd"/>
-            <w:r>
-              <w:rPr>
-                <w:b/>
-                <w:sz w:val="20"/>
-                <w:szCs w:val="20"/>
-                <w:lang w:val="en-GB"/>
-              </w:rPr>
-              <w:t>. No.</w:t>
-            </w:r>
-            <w:r>
-              <w:rPr>
-                <w:b/>
-                <w:sz w:val="20"/>
-                <w:szCs w:val="20"/>
-                <w:lang w:val="en-GB"/>
-              </w:rPr>
-              <w:t xml:space="preserve"> &amp; Transport</w:t>
+              <w:t>. No. &amp; Transport</w:t>
             </w:r>
           </w:p>
         </w:tc>
@@ -1005,7 +1154,6 @@
           <w:p>
             <w:pPr>
               <w:rPr>
-                <w:color w:val="00B050"/>
                 <w:sz w:val="20"/>
                 <w:szCs w:val="20"/>
               </w:rPr>
@@ -1031,6 +1179,22 @@
                 <w:sz w:val="20"/>
                 <w:szCs w:val="20"/>
               </w:rPr>
+              <w:t>} ${</w:t>
+            </w:r>
+            <w:proofErr w:type="spellStart"/>
+            <w:r>
+              <w:rPr>
+                <w:sz w:val="20"/>
+                <w:szCs w:val="20"/>
+              </w:rPr>
+              <w:t>firstname</w:t>
+            </w:r>
+            <w:proofErr w:type="spellEnd"/>
+            <w:r>
+              <w:rPr>
+                <w:sz w:val="20"/>
+                <w:szCs w:val="20"/>
+              </w:rPr>
               <w:t>}</w:t>
             </w:r>
             <w:r>
@@ -1038,10 +1202,36 @@
                 <w:sz w:val="20"/>
                 <w:szCs w:val="20"/>
               </w:rPr>
+              <w:br/>
+              <w:t>${</w:t>
+            </w:r>
+            <w:proofErr w:type="spellStart"/>
+            <w:r>
+              <w:rPr>
+                <w:sz w:val="20"/>
+                <w:szCs w:val="20"/>
+              </w:rPr>
+              <w:t>sacMemberId</w:t>
+            </w:r>
+            <w:proofErr w:type="spellEnd"/>
+            <w:r>
+              <w:rPr>
+                <w:sz w:val="20"/>
+                <w:szCs w:val="20"/>
+              </w:rPr>
+              <w:t>}</w:t>
+            </w:r>
+            <w:r>
+              <w:rPr>
+                <w:sz w:val="20"/>
+                <w:szCs w:val="20"/>
+              </w:rPr>
               <w:t xml:space="preserve"> </w:t>
             </w:r>
             <w:r>
               <w:rPr>
+                <w:b/>
+                <w:color w:val="FF0000"/>
                 <w:sz w:val="20"/>
                 <w:szCs w:val="20"/>
               </w:rPr>
@@ -1050,14 +1240,18 @@
             <w:proofErr w:type="spellStart"/>
             <w:r>
               <w:rPr>
-                <w:sz w:val="20"/>
-                <w:szCs w:val="20"/>
-              </w:rPr>
-              <w:t>firstname</w:t>
+                <w:b/>
+                <w:color w:val="FF0000"/>
+                <w:sz w:val="20"/>
+                <w:szCs w:val="20"/>
+              </w:rPr>
+              <w:t>isNotSacMember</w:t>
             </w:r>
             <w:proofErr w:type="spellEnd"/>
             <w:r>
               <w:rPr>
+                <w:b/>
+                <w:color w:val="FF0000"/>
                 <w:sz w:val="20"/>
                 <w:szCs w:val="20"/>
               </w:rPr>
@@ -1065,40 +1259,8 @@
             </w:r>
             <w:r>
               <w:rPr>
-                <w:sz w:val="20"/>
-                <w:szCs w:val="20"/>
-              </w:rPr>
-              <w:t xml:space="preserve"> </w:t>
-            </w:r>
-            <w:r>
-              <w:rPr>
-                <w:color w:val="00B050"/>
-                <w:sz w:val="20"/>
-                <w:szCs w:val="20"/>
-              </w:rPr>
-              <w:t>${</w:t>
-            </w:r>
-            <w:proofErr w:type="spellStart"/>
-            <w:r>
-              <w:rPr>
-                <w:color w:val="00B050"/>
-                <w:sz w:val="20"/>
-                <w:szCs w:val="20"/>
-              </w:rPr>
-              <w:t>ageInfo</w:t>
-            </w:r>
-            <w:proofErr w:type="spellEnd"/>
-            <w:r>
-              <w:rPr>
-                <w:color w:val="00B050"/>
-                <w:sz w:val="20"/>
-                <w:szCs w:val="20"/>
-              </w:rPr>
-              <w:t>}</w:t>
-            </w:r>
-            <w:r>
-              <w:rPr>
-                <w:color w:val="D0CECE" w:themeColor="background2" w:themeShade="E6"/>
+                <w:b/>
+                <w:color w:val="FF0000"/>
                 <w:sz w:val="20"/>
                 <w:szCs w:val="20"/>
               </w:rPr>
@@ -1109,141 +1271,7 @@
                 <w:sz w:val="20"/>
                 <w:szCs w:val="20"/>
               </w:rPr>
-              <w:t>${</w:t>
-            </w:r>
-            <w:proofErr w:type="spellStart"/>
-            <w:r>
-              <w:rPr>
-                <w:sz w:val="20"/>
-                <w:szCs w:val="20"/>
-              </w:rPr>
-              <w:t>sacMemberId</w:t>
-            </w:r>
-            <w:proofErr w:type="spellEnd"/>
-            <w:r>
-              <w:rPr>
-                <w:sz w:val="20"/>
-                <w:szCs w:val="20"/>
-              </w:rPr>
-              <w:t>}</w:t>
-            </w:r>
-            <w:r>
-              <w:rPr>
-                <w:sz w:val="20"/>
-                <w:szCs w:val="20"/>
-              </w:rPr>
-              <w:t xml:space="preserve"> </w:t>
-            </w:r>
-            <w:r>
-              <w:rPr>
-                <w:sz w:val="20"/>
-                <w:szCs w:val="20"/>
-              </w:rPr>
-              <w:t>${</w:t>
-            </w:r>
-            <w:proofErr w:type="spellStart"/>
-            <w:r>
-              <w:rPr>
-                <w:sz w:val="20"/>
-                <w:szCs w:val="20"/>
-              </w:rPr>
-              <w:t>memberInSection</w:t>
-            </w:r>
-            <w:proofErr w:type="spellEnd"/>
-            <w:r>
-              <w:rPr>
-                <w:sz w:val="20"/>
-                <w:szCs w:val="20"/>
-              </w:rPr>
-              <w:t xml:space="preserve">} </w:t>
-            </w:r>
-            <w:r>
-              <w:rPr>
-                <w:b/>
-                <w:color w:val="FF0000"/>
-                <w:sz w:val="20"/>
-                <w:szCs w:val="20"/>
-              </w:rPr>
-              <w:t>${</w:t>
-            </w:r>
-            <w:proofErr w:type="spellStart"/>
-            <w:r>
-              <w:rPr>
-                <w:b/>
-                <w:color w:val="FF0000"/>
-                <w:sz w:val="20"/>
-                <w:szCs w:val="20"/>
-              </w:rPr>
-              <w:t>is</w:t>
-            </w:r>
-            <w:r>
-              <w:rPr>
-                <w:b/>
-                <w:color w:val="FF0000"/>
-                <w:sz w:val="20"/>
-                <w:szCs w:val="20"/>
-              </w:rPr>
-              <w:t>Not</w:t>
-            </w:r>
-            <w:r>
-              <w:rPr>
-                <w:b/>
-                <w:color w:val="FF0000"/>
-                <w:sz w:val="20"/>
-                <w:szCs w:val="20"/>
-              </w:rPr>
-              <w:t>Sac</w:t>
-            </w:r>
-            <w:r>
-              <w:rPr>
-                <w:b/>
-                <w:color w:val="FF0000"/>
-                <w:sz w:val="20"/>
-                <w:szCs w:val="20"/>
-              </w:rPr>
-              <w:t>Member</w:t>
-            </w:r>
-            <w:proofErr w:type="spellEnd"/>
-            <w:r>
-              <w:rPr>
-                <w:b/>
-                <w:color w:val="FF0000"/>
-                <w:sz w:val="20"/>
-                <w:szCs w:val="20"/>
-              </w:rPr>
-              <w:t>}</w:t>
-            </w:r>
-            <w:r>
-              <w:rPr>
-                <w:b/>
-                <w:color w:val="FF0000"/>
-                <w:sz w:val="20"/>
-                <w:szCs w:val="20"/>
-              </w:rPr>
-              <w:br/>
-            </w:r>
-            <w:r>
-              <w:rPr>
-                <w:sz w:val="20"/>
-                <w:szCs w:val="20"/>
-              </w:rPr>
-              <w:t>${</w:t>
-            </w:r>
-            <w:proofErr w:type="gramStart"/>
-            <w:r>
-              <w:rPr>
-                <w:sz w:val="20"/>
-                <w:szCs w:val="20"/>
-              </w:rPr>
-              <w:t>email</w:t>
-            </w:r>
-            <w:proofErr w:type="gramEnd"/>
-            <w:r>
-              <w:rPr>
-                <w:sz w:val="20"/>
-                <w:szCs w:val="20"/>
-              </w:rPr>
-              <w:t>}</w:t>
+              <w:t>${email}</w:t>
             </w:r>
             <w:r>
               <w:rPr>
@@ -1338,61 +1366,48 @@
               </w:rPr>
               <w:t>}</w:t>
             </w:r>
+          </w:p>
+        </w:tc>
+        <w:tc>
+          <w:tcPr>
+            <w:tcW w:w="4252" w:type="dxa"/>
+          </w:tcPr>
+          <w:p>
+            <w:pPr>
+              <w:rPr>
+                <w:sz w:val="20"/>
+                <w:szCs w:val="20"/>
+              </w:rPr>
+            </w:pPr>
+            <w:r>
+              <w:rPr>
+                <w:sz w:val="20"/>
+                <w:szCs w:val="20"/>
+              </w:rPr>
+              <w:t>Tel: ${</w:t>
+            </w:r>
+            <w:proofErr w:type="spellStart"/>
+            <w:r>
+              <w:rPr>
+                <w:sz w:val="20"/>
+                <w:szCs w:val="20"/>
+              </w:rPr>
+              <w:t>phone</w:t>
+            </w:r>
+            <w:proofErr w:type="spellEnd"/>
+            <w:r>
+              <w:rPr>
+                <w:sz w:val="20"/>
+                <w:szCs w:val="20"/>
+              </w:rPr>
+              <w:t>}</w:t>
+            </w:r>
             <w:r>
               <w:rPr>
                 <w:sz w:val="20"/>
                 <w:szCs w:val="20"/>
               </w:rPr>
               <w:br/>
-            </w:r>
-          </w:p>
-        </w:tc>
-        <w:tc>
-          <w:tcPr>
-            <w:tcW w:w="4252" w:type="dxa"/>
-          </w:tcPr>
-          <w:p>
-            <w:pPr>
-              <w:rPr>
-                <w:sz w:val="20"/>
-                <w:szCs w:val="20"/>
-              </w:rPr>
-            </w:pPr>
-            <w:r>
-              <w:rPr>
-                <w:sz w:val="20"/>
-                <w:szCs w:val="20"/>
-              </w:rPr>
-              <w:t>${</w:t>
-            </w:r>
-            <w:proofErr w:type="spellStart"/>
-            <w:r>
-              <w:rPr>
-                <w:sz w:val="20"/>
-                <w:szCs w:val="20"/>
-              </w:rPr>
-              <w:t>phone</w:t>
-            </w:r>
-            <w:proofErr w:type="spellEnd"/>
-            <w:r>
-              <w:rPr>
-                <w:sz w:val="20"/>
-                <w:szCs w:val="20"/>
-              </w:rPr>
-              <w:t>}</w:t>
-            </w:r>
-            <w:r>
-              <w:rPr>
-                <w:sz w:val="20"/>
-                <w:szCs w:val="20"/>
-              </w:rPr>
-              <w:br/>
-            </w:r>
-            <w:r>
-              <w:rPr>
-                <w:sz w:val="20"/>
-                <w:szCs w:val="20"/>
-              </w:rPr>
               <w:t xml:space="preserve">Im Notfall: </w:t>
             </w:r>
             <w:r>
@@ -1462,32 +1477,6 @@
                 <w:szCs w:val="20"/>
               </w:rPr>
             </w:pPr>
-            <w:r>
-              <w:rPr>
-                <w:color w:val="767171" w:themeColor="background2" w:themeShade="80"/>
-                <w:sz w:val="20"/>
-                <w:szCs w:val="20"/>
-              </w:rPr>
-              <w:t>${</w:t>
-            </w:r>
-            <w:proofErr w:type="spellStart"/>
-            <w:r>
-              <w:rPr>
-                <w:color w:val="767171" w:themeColor="background2" w:themeShade="80"/>
-                <w:sz w:val="20"/>
-                <w:szCs w:val="20"/>
-              </w:rPr>
-              <w:t>remarks</w:t>
-            </w:r>
-            <w:proofErr w:type="spellEnd"/>
-            <w:r>
-              <w:rPr>
-                <w:color w:val="767171" w:themeColor="background2" w:themeShade="80"/>
-                <w:sz w:val="20"/>
-                <w:szCs w:val="20"/>
-              </w:rPr>
-              <w:t>}</w:t>
-            </w:r>
           </w:p>
         </w:tc>
       </w:tr>

</xml_diff>

<commit_message>
Add the Min- and max Teilnehmerzahl to the PDF Teilnehmerliste See: https://github.com/jonasmueller1/sac-pilatus-website/issues/211#issuecomment-3501099896
</commit_message>
<xml_diff>
--- a/contao/templates/docx/event_memberlist.docx
+++ b/contao/templates/docx/event_memberlist.docx
@@ -777,7 +777,31 @@
                 <w:sz w:val="20"/>
                 <w:szCs w:val="20"/>
               </w:rPr>
-              <w:t>Min. und Max. TN-Zahl</w:t>
+              <w:t>Min.</w:t>
+            </w:r>
+            <w:r>
+              <w:rPr>
+                <w:b/>
+                <w:sz w:val="20"/>
+                <w:szCs w:val="20"/>
+              </w:rPr>
+              <w:t>/</w:t>
+            </w:r>
+            <w:r>
+              <w:rPr>
+                <w:b/>
+                <w:sz w:val="20"/>
+                <w:szCs w:val="20"/>
+              </w:rPr>
+              <w:t>Max. T</w:t>
+            </w:r>
+            <w:r>
+              <w:rPr>
+                <w:b/>
+                <w:sz w:val="20"/>
+                <w:szCs w:val="20"/>
+              </w:rPr>
+              <w:t>eilnehmende</w:t>
             </w:r>
           </w:p>
         </w:tc>
@@ -915,7 +939,7 @@
     </w:p>
     <w:tbl>
       <w:tblPr>
-        <w:tblW w:w="15559" w:type="dxa"/>
+        <w:tblW w:w="0" w:type="auto"/>
         <w:tblBorders>
           <w:top w:val="single" w:sz="2" w:space="0" w:color="auto"/>
           <w:left w:val="single" w:sz="2" w:space="0" w:color="auto"/>
@@ -929,12 +953,15 @@
       <w:tblGrid>
         <w:gridCol w:w="519"/>
         <w:gridCol w:w="764"/>
-        <w:gridCol w:w="4921"/>
-        <w:gridCol w:w="2693"/>
-        <w:gridCol w:w="4252"/>
-        <w:gridCol w:w="2410"/>
+        <w:gridCol w:w="4864"/>
+        <w:gridCol w:w="2660"/>
+        <w:gridCol w:w="4216"/>
+        <w:gridCol w:w="2391"/>
       </w:tblGrid>
       <w:tr>
+        <w:trPr>
+          <w:cantSplit/>
+        </w:trPr>
         <w:tc>
           <w:tcPr>
             <w:tcW w:w="519" w:type="dxa"/>
@@ -968,7 +995,23 @@
                 <w:sz w:val="20"/>
                 <w:szCs w:val="20"/>
               </w:rPr>
-              <w:t>Funk.</w:t>
+              <w:t>Funk</w:t>
+            </w:r>
+            <w:r>
+              <w:rPr>
+                <w:b/>
+                <w:sz w:val="20"/>
+                <w:szCs w:val="20"/>
+              </w:rPr>
+              <w:t>t</w:t>
+            </w:r>
+            <w:r>
+              <w:rPr>
+                <w:b/>
+                <w:sz w:val="20"/>
+                <w:szCs w:val="20"/>
+              </w:rPr>
+              <w:t>.</w:t>
             </w:r>
           </w:p>
         </w:tc>
@@ -1271,7 +1314,23 @@
                 <w:sz w:val="20"/>
                 <w:szCs w:val="20"/>
               </w:rPr>
-              <w:t>${email}</w:t>
+              <w:t>${</w:t>
+            </w:r>
+            <w:proofErr w:type="gramStart"/>
+            <w:r>
+              <w:rPr>
+                <w:sz w:val="20"/>
+                <w:szCs w:val="20"/>
+              </w:rPr>
+              <w:t>email</w:t>
+            </w:r>
+            <w:proofErr w:type="gramEnd"/>
+            <w:r>
+              <w:rPr>
+                <w:sz w:val="20"/>
+                <w:szCs w:val="20"/>
+              </w:rPr>
+              <w:t>}</w:t>
             </w:r>
             <w:r>
               <w:rPr>
@@ -1499,6 +1558,9 @@
         <w:gridCol w:w="11091"/>
       </w:tblGrid>
       <w:tr>
+        <w:trPr>
+          <w:cantSplit/>
+        </w:trPr>
         <w:tc>
           <w:tcPr>
             <w:tcW w:w="4361" w:type="dxa"/>

</xml_diff>

<commit_message>
Restore the age info and the remarks in the memberlist See: https://github.com/jonasmueller1/sac-pilatus-website/issues/211#issuecomment-3506794541
</commit_message>
<xml_diff>
--- a/contao/templates/docx/event_memberlist.docx
+++ b/contao/templates/docx/event_memberlist.docx
@@ -953,10 +953,10 @@
       <w:tblGrid>
         <w:gridCol w:w="519"/>
         <w:gridCol w:w="764"/>
-        <w:gridCol w:w="4864"/>
-        <w:gridCol w:w="2660"/>
-        <w:gridCol w:w="4216"/>
-        <w:gridCol w:w="2391"/>
+        <w:gridCol w:w="4920"/>
+        <w:gridCol w:w="2692"/>
+        <w:gridCol w:w="4251"/>
+        <w:gridCol w:w="2268"/>
       </w:tblGrid>
       <w:tr>
         <w:trPr>
@@ -995,23 +995,7 @@
                 <w:sz w:val="20"/>
                 <w:szCs w:val="20"/>
               </w:rPr>
-              <w:t>Funk</w:t>
-            </w:r>
-            <w:r>
-              <w:rPr>
-                <w:b/>
-                <w:sz w:val="20"/>
-                <w:szCs w:val="20"/>
-              </w:rPr>
-              <w:t>t</w:t>
-            </w:r>
-            <w:r>
-              <w:rPr>
-                <w:b/>
-                <w:sz w:val="20"/>
-                <w:szCs w:val="20"/>
-              </w:rPr>
-              <w:t>.</w:t>
+              <w:t>Funkt.</w:t>
             </w:r>
           </w:p>
         </w:tc>
@@ -1108,20 +1092,22 @@
         </w:tc>
         <w:tc>
           <w:tcPr>
-            <w:tcW w:w="2410" w:type="dxa"/>
+            <w:tcW w:w="2268" w:type="dxa"/>
             <w:vAlign w:val="center"/>
           </w:tcPr>
           <w:p>
             <w:pPr>
               <w:rPr>
                 <w:b/>
-                <w:sz w:val="20"/>
-                <w:szCs w:val="20"/>
-              </w:rPr>
-            </w:pPr>
-            <w:r>
-              <w:rPr>
-                <w:b/>
+                <w:color w:val="000000" w:themeColor="text1"/>
+                <w:sz w:val="20"/>
+                <w:szCs w:val="20"/>
+              </w:rPr>
+            </w:pPr>
+            <w:r>
+              <w:rPr>
+                <w:b/>
+                <w:color w:val="000000" w:themeColor="text1"/>
                 <w:sz w:val="20"/>
                 <w:szCs w:val="20"/>
               </w:rPr>
@@ -1245,6 +1231,39 @@
                 <w:sz w:val="20"/>
                 <w:szCs w:val="20"/>
               </w:rPr>
+              <w:t xml:space="preserve"> </w:t>
+            </w:r>
+            <w:r>
+              <w:rPr>
+                <w:color w:val="00B050"/>
+                <w:sz w:val="20"/>
+                <w:szCs w:val="20"/>
+              </w:rPr>
+              <w:t>${</w:t>
+            </w:r>
+            <w:proofErr w:type="spellStart"/>
+            <w:r>
+              <w:rPr>
+                <w:color w:val="00B050"/>
+                <w:sz w:val="20"/>
+                <w:szCs w:val="20"/>
+              </w:rPr>
+              <w:t>ageInfo</w:t>
+            </w:r>
+            <w:proofErr w:type="spellEnd"/>
+            <w:r>
+              <w:rPr>
+                <w:color w:val="00B050"/>
+                <w:sz w:val="20"/>
+                <w:szCs w:val="20"/>
+              </w:rPr>
+              <w:t>}</w:t>
+            </w:r>
+            <w:r>
+              <w:rPr>
+                <w:sz w:val="20"/>
+                <w:szCs w:val="20"/>
+              </w:rPr>
               <w:br/>
               <w:t>${</w:t>
             </w:r>
@@ -1527,15 +1546,42 @@
         </w:tc>
         <w:tc>
           <w:tcPr>
-            <w:tcW w:w="2410" w:type="dxa"/>
-          </w:tcPr>
-          <w:p>
-            <w:pPr>
-              <w:rPr>
-                <w:sz w:val="20"/>
-                <w:szCs w:val="20"/>
-              </w:rPr>
-            </w:pPr>
+            <w:tcW w:w="2268" w:type="dxa"/>
+          </w:tcPr>
+          <w:p>
+            <w:pPr>
+              <w:rPr>
+                <w:color w:val="000000" w:themeColor="text1"/>
+                <w:sz w:val="20"/>
+                <w:szCs w:val="20"/>
+              </w:rPr>
+            </w:pPr>
+            <w:r>
+              <w:rPr>
+                <w:color w:val="000000" w:themeColor="text1"/>
+                <w:sz w:val="20"/>
+                <w:szCs w:val="20"/>
+              </w:rPr>
+              <w:t>${</w:t>
+            </w:r>
+            <w:proofErr w:type="spellStart"/>
+            <w:r>
+              <w:rPr>
+                <w:color w:val="000000" w:themeColor="text1"/>
+                <w:sz w:val="20"/>
+                <w:szCs w:val="20"/>
+              </w:rPr>
+              <w:t>remarks</w:t>
+            </w:r>
+            <w:proofErr w:type="spellEnd"/>
+            <w:r>
+              <w:rPr>
+                <w:color w:val="000000" w:themeColor="text1"/>
+                <w:sz w:val="20"/>
+                <w:szCs w:val="20"/>
+              </w:rPr>
+              <w:t>}</w:t>
+            </w:r>
           </w:p>
         </w:tc>
       </w:tr>
@@ -1643,53 +1689,12 @@
           <w:szCs w:val="20"/>
         </w:rPr>
       </w:pPr>
-      <w:r>
-        <w:rPr>
-          <w:sz w:val="20"/>
-          <w:szCs w:val="20"/>
-        </w:rPr>
-        <w:t xml:space="preserve">Event-ID: </w:t>
-      </w:r>
-      <w:r>
-        <w:rPr>
-          <w:sz w:val="20"/>
-          <w:szCs w:val="20"/>
-        </w:rPr>
-        <w:t>${</w:t>
-      </w:r>
-      <w:proofErr w:type="spellStart"/>
-      <w:r>
-        <w:rPr>
-          <w:sz w:val="20"/>
-          <w:szCs w:val="20"/>
-        </w:rPr>
-        <w:t>event</w:t>
-      </w:r>
-      <w:r>
-        <w:rPr>
-          <w:sz w:val="20"/>
-          <w:szCs w:val="20"/>
-        </w:rPr>
-        <w:t>Id</w:t>
-      </w:r>
-      <w:proofErr w:type="spellEnd"/>
-      <w:r>
-        <w:rPr>
-          <w:sz w:val="20"/>
-          <w:szCs w:val="20"/>
-        </w:rPr>
-        <w:t>}</w:t>
-      </w:r>
     </w:p>
     <w:sectPr>
-      <w:headerReference w:type="even" r:id="rId7"/>
-      <w:headerReference w:type="default" r:id="rId8"/>
-      <w:footerReference w:type="even" r:id="rId9"/>
-      <w:footerReference w:type="default" r:id="rId10"/>
-      <w:headerReference w:type="first" r:id="rId11"/>
-      <w:footerReference w:type="first" r:id="rId12"/>
+      <w:headerReference w:type="default" r:id="rId7"/>
+      <w:footerReference w:type="default" r:id="rId8"/>
       <w:pgSz w:w="16838" w:h="11906" w:orient="landscape"/>
-      <w:pgMar w:top="-1560" w:right="851" w:bottom="851" w:left="567" w:header="284" w:footer="709" w:gutter="0"/>
+      <w:pgMar w:top="-1560" w:right="851" w:bottom="851" w:left="567" w:header="284" w:footer="280" w:gutter="0"/>
       <w:cols w:space="708"/>
       <w:docGrid w:linePitch="360"/>
     </w:sectPr>
@@ -1725,29 +1730,43 @@
 <file path=word/footer1.xml><?xml version="1.0" encoding="utf-8"?>
 <w:ftr xmlns:wpc="http://schemas.microsoft.com/office/word/2010/wordprocessingCanvas" xmlns:cx="http://schemas.microsoft.com/office/drawing/2014/chartex" xmlns:cx1="http://schemas.microsoft.com/office/drawing/2015/9/8/chartex" xmlns:cx2="http://schemas.microsoft.com/office/drawing/2015/10/21/chartex" xmlns:cx3="http://schemas.microsoft.com/office/drawing/2016/5/9/chartex" xmlns:cx4="http://schemas.microsoft.com/office/drawing/2016/5/10/chartex" xmlns:cx5="http://schemas.microsoft.com/office/drawing/2016/5/11/chartex" xmlns:cx6="http://schemas.microsoft.com/office/drawing/2016/5/12/chartex" xmlns:cx7="http://schemas.microsoft.com/office/drawing/2016/5/13/chartex" xmlns:cx8="http://schemas.microsoft.com/office/drawing/2016/5/14/chartex" xmlns:mc="http://schemas.openxmlformats.org/markup-compatibility/2006" xmlns:aink="http://schemas.microsoft.com/office/drawing/2016/ink" xmlns:am3d="http://schemas.microsoft.com/office/drawing/2017/model3d" xmlns:o="urn:schemas-microsoft-com:office:office" xmlns:oel="http://schemas.microsoft.com/office/2019/extlst" xmlns:r="http://schemas.openxmlformats.org/officeDocument/2006/relationships" xmlns:m="http://schemas.openxmlformats.org/officeDocument/2006/math" xmlns:v="urn:schemas-microsoft-com:vml" xmlns:wp14="http://schemas.microsoft.com/office/word/2010/wordprocessingDrawing" xmlns:wp="http://schemas.openxmlformats.org/drawingml/2006/wordprocessingDrawing" xmlns:w10="urn:schemas-microsoft-com:office:word" xmlns:w="http://schemas.openxmlformats.org/wordprocessingml/2006/main" xmlns:w14="http://schemas.microsoft.com/office/word/2010/wordml" xmlns:w15="http://schemas.microsoft.com/office/word/2012/wordml" xmlns:w16cex="http://schemas.microsoft.com/office/word/2018/wordml/cex" xmlns:w16cid="http://schemas.microsoft.com/office/word/2016/wordml/cid" xmlns:w16="http://schemas.microsoft.com/office/word/2018/wordml" xmlns:w16du="http://schemas.microsoft.com/office/word/2023/wordml/word16du" xmlns:w16sdtdh="http://schemas.microsoft.com/office/word/2020/wordml/sdtdatahash" xmlns:w16sdtfl="http://schemas.microsoft.com/office/word/2024/wordml/sdtformatlock" xmlns:w16se="http://schemas.microsoft.com/office/word/2015/wordml/symex" xmlns:wpg="http://schemas.microsoft.com/office/word/2010/wordprocessingGroup" xmlns:wpi="http://schemas.microsoft.com/office/word/2010/wordprocessingInk" xmlns:wne="http://schemas.microsoft.com/office/word/2006/wordml" xmlns:wps="http://schemas.microsoft.com/office/word/2010/wordprocessingShape" mc:Ignorable="w14 w15 w16se w16cid w16 w16cex w16sdtdh w16sdtfl w16du wp14">
   <w:p>
-    <w:pPr>
-      <w:pStyle w:val="Fuzeile"/>
-    </w:pPr>
-  </w:p>
-</w:ftr>
-</file>
-
-<file path=word/footer2.xml><?xml version="1.0" encoding="utf-8"?>
-<w:ftr xmlns:wpc="http://schemas.microsoft.com/office/word/2010/wordprocessingCanvas" xmlns:cx="http://schemas.microsoft.com/office/drawing/2014/chartex" xmlns:cx1="http://schemas.microsoft.com/office/drawing/2015/9/8/chartex" xmlns:cx2="http://schemas.microsoft.com/office/drawing/2015/10/21/chartex" xmlns:cx3="http://schemas.microsoft.com/office/drawing/2016/5/9/chartex" xmlns:cx4="http://schemas.microsoft.com/office/drawing/2016/5/10/chartex" xmlns:cx5="http://schemas.microsoft.com/office/drawing/2016/5/11/chartex" xmlns:cx6="http://schemas.microsoft.com/office/drawing/2016/5/12/chartex" xmlns:cx7="http://schemas.microsoft.com/office/drawing/2016/5/13/chartex" xmlns:cx8="http://schemas.microsoft.com/office/drawing/2016/5/14/chartex" xmlns:mc="http://schemas.openxmlformats.org/markup-compatibility/2006" xmlns:aink="http://schemas.microsoft.com/office/drawing/2016/ink" xmlns:am3d="http://schemas.microsoft.com/office/drawing/2017/model3d" xmlns:o="urn:schemas-microsoft-com:office:office" xmlns:oel="http://schemas.microsoft.com/office/2019/extlst" xmlns:r="http://schemas.openxmlformats.org/officeDocument/2006/relationships" xmlns:m="http://schemas.openxmlformats.org/officeDocument/2006/math" xmlns:v="urn:schemas-microsoft-com:vml" xmlns:wp14="http://schemas.microsoft.com/office/word/2010/wordprocessingDrawing" xmlns:wp="http://schemas.openxmlformats.org/drawingml/2006/wordprocessingDrawing" xmlns:w10="urn:schemas-microsoft-com:office:word" xmlns:w="http://schemas.openxmlformats.org/wordprocessingml/2006/main" xmlns:w14="http://schemas.microsoft.com/office/word/2010/wordml" xmlns:w15="http://schemas.microsoft.com/office/word/2012/wordml" xmlns:w16cex="http://schemas.microsoft.com/office/word/2018/wordml/cex" xmlns:w16cid="http://schemas.microsoft.com/office/word/2016/wordml/cid" xmlns:w16="http://schemas.microsoft.com/office/word/2018/wordml" xmlns:w16du="http://schemas.microsoft.com/office/word/2023/wordml/word16du" xmlns:w16sdtdh="http://schemas.microsoft.com/office/word/2020/wordml/sdtdatahash" xmlns:w16sdtfl="http://schemas.microsoft.com/office/word/2024/wordml/sdtformatlock" xmlns:w16se="http://schemas.microsoft.com/office/word/2015/wordml/symex" xmlns:wpg="http://schemas.microsoft.com/office/word/2010/wordprocessingGroup" xmlns:wpi="http://schemas.microsoft.com/office/word/2010/wordprocessingInk" xmlns:wne="http://schemas.microsoft.com/office/word/2006/wordml" xmlns:wps="http://schemas.microsoft.com/office/word/2010/wordprocessingShape" mc:Ignorable="w14 w15 w16se w16cid w16 w16cex w16sdtdh w16sdtfl w16du wp14">
-  <w:p>
-    <w:pPr>
-      <w:pStyle w:val="Fuzeile"/>
-    </w:pPr>
-  </w:p>
-</w:ftr>
-</file>
-
-<file path=word/footer3.xml><?xml version="1.0" encoding="utf-8"?>
-<w:ftr xmlns:wpc="http://schemas.microsoft.com/office/word/2010/wordprocessingCanvas" xmlns:cx="http://schemas.microsoft.com/office/drawing/2014/chartex" xmlns:cx1="http://schemas.microsoft.com/office/drawing/2015/9/8/chartex" xmlns:cx2="http://schemas.microsoft.com/office/drawing/2015/10/21/chartex" xmlns:cx3="http://schemas.microsoft.com/office/drawing/2016/5/9/chartex" xmlns:cx4="http://schemas.microsoft.com/office/drawing/2016/5/10/chartex" xmlns:cx5="http://schemas.microsoft.com/office/drawing/2016/5/11/chartex" xmlns:cx6="http://schemas.microsoft.com/office/drawing/2016/5/12/chartex" xmlns:cx7="http://schemas.microsoft.com/office/drawing/2016/5/13/chartex" xmlns:cx8="http://schemas.microsoft.com/office/drawing/2016/5/14/chartex" xmlns:mc="http://schemas.openxmlformats.org/markup-compatibility/2006" xmlns:aink="http://schemas.microsoft.com/office/drawing/2016/ink" xmlns:am3d="http://schemas.microsoft.com/office/drawing/2017/model3d" xmlns:o="urn:schemas-microsoft-com:office:office" xmlns:oel="http://schemas.microsoft.com/office/2019/extlst" xmlns:r="http://schemas.openxmlformats.org/officeDocument/2006/relationships" xmlns:m="http://schemas.openxmlformats.org/officeDocument/2006/math" xmlns:v="urn:schemas-microsoft-com:vml" xmlns:wp14="http://schemas.microsoft.com/office/word/2010/wordprocessingDrawing" xmlns:wp="http://schemas.openxmlformats.org/drawingml/2006/wordprocessingDrawing" xmlns:w10="urn:schemas-microsoft-com:office:word" xmlns:w="http://schemas.openxmlformats.org/wordprocessingml/2006/main" xmlns:w14="http://schemas.microsoft.com/office/word/2010/wordml" xmlns:w15="http://schemas.microsoft.com/office/word/2012/wordml" xmlns:w16cex="http://schemas.microsoft.com/office/word/2018/wordml/cex" xmlns:w16cid="http://schemas.microsoft.com/office/word/2016/wordml/cid" xmlns:w16="http://schemas.microsoft.com/office/word/2018/wordml" xmlns:w16du="http://schemas.microsoft.com/office/word/2023/wordml/word16du" xmlns:w16sdtdh="http://schemas.microsoft.com/office/word/2020/wordml/sdtdatahash" xmlns:w16sdtfl="http://schemas.microsoft.com/office/word/2024/wordml/sdtformatlock" xmlns:w16se="http://schemas.microsoft.com/office/word/2015/wordml/symex" xmlns:wpg="http://schemas.microsoft.com/office/word/2010/wordprocessingGroup" xmlns:wpi="http://schemas.microsoft.com/office/word/2010/wordprocessingInk" xmlns:wne="http://schemas.microsoft.com/office/word/2006/wordml" xmlns:wps="http://schemas.microsoft.com/office/word/2010/wordprocessingShape" mc:Ignorable="w14 w15 w16se w16cid w16 w16cex w16sdtdh w16sdtfl w16du wp14">
-  <w:p>
-    <w:pPr>
-      <w:pStyle w:val="Fuzeile"/>
-    </w:pPr>
+    <w:r>
+      <w:rPr>
+        <w:sz w:val="20"/>
+        <w:szCs w:val="20"/>
+      </w:rPr>
+      <w:t xml:space="preserve">Event-ID: </w:t>
+    </w:r>
+    <w:r>
+      <w:rPr>
+        <w:sz w:val="20"/>
+        <w:szCs w:val="20"/>
+      </w:rPr>
+      <w:t>${</w:t>
+    </w:r>
+    <w:proofErr w:type="spellStart"/>
+    <w:r>
+      <w:rPr>
+        <w:sz w:val="20"/>
+        <w:szCs w:val="20"/>
+      </w:rPr>
+      <w:t>event</w:t>
+    </w:r>
+    <w:r>
+      <w:rPr>
+        <w:sz w:val="20"/>
+        <w:szCs w:val="20"/>
+      </w:rPr>
+      <w:t>Id</w:t>
+    </w:r>
+    <w:proofErr w:type="spellEnd"/>
+    <w:r>
+      <w:rPr>
+        <w:sz w:val="20"/>
+        <w:szCs w:val="20"/>
+      </w:rPr>
+      <w:t>}</w:t>
+    </w:r>
   </w:p>
 </w:ftr>
 </file>
@@ -1782,16 +1801,6 @@
   <w:p>
     <w:pPr>
       <w:pStyle w:val="Kopfzeile"/>
-    </w:pPr>
-  </w:p>
-</w:hdr>
-</file>
-
-<file path=word/header2.xml><?xml version="1.0" encoding="utf-8"?>
-<w:hdr xmlns:wpc="http://schemas.microsoft.com/office/word/2010/wordprocessingCanvas" xmlns:cx="http://schemas.microsoft.com/office/drawing/2014/chartex" xmlns:cx1="http://schemas.microsoft.com/office/drawing/2015/9/8/chartex" xmlns:cx2="http://schemas.microsoft.com/office/drawing/2015/10/21/chartex" xmlns:cx3="http://schemas.microsoft.com/office/drawing/2016/5/9/chartex" xmlns:cx4="http://schemas.microsoft.com/office/drawing/2016/5/10/chartex" xmlns:cx5="http://schemas.microsoft.com/office/drawing/2016/5/11/chartex" xmlns:cx6="http://schemas.microsoft.com/office/drawing/2016/5/12/chartex" xmlns:cx7="http://schemas.microsoft.com/office/drawing/2016/5/13/chartex" xmlns:cx8="http://schemas.microsoft.com/office/drawing/2016/5/14/chartex" xmlns:mc="http://schemas.openxmlformats.org/markup-compatibility/2006" xmlns:aink="http://schemas.microsoft.com/office/drawing/2016/ink" xmlns:am3d="http://schemas.microsoft.com/office/drawing/2017/model3d" xmlns:o="urn:schemas-microsoft-com:office:office" xmlns:oel="http://schemas.microsoft.com/office/2019/extlst" xmlns:r="http://schemas.openxmlformats.org/officeDocument/2006/relationships" xmlns:m="http://schemas.openxmlformats.org/officeDocument/2006/math" xmlns:v="urn:schemas-microsoft-com:vml" xmlns:wp14="http://schemas.microsoft.com/office/word/2010/wordprocessingDrawing" xmlns:wp="http://schemas.openxmlformats.org/drawingml/2006/wordprocessingDrawing" xmlns:w10="urn:schemas-microsoft-com:office:word" xmlns:w="http://schemas.openxmlformats.org/wordprocessingml/2006/main" xmlns:w14="http://schemas.microsoft.com/office/word/2010/wordml" xmlns:w15="http://schemas.microsoft.com/office/word/2012/wordml" xmlns:w16cex="http://schemas.microsoft.com/office/word/2018/wordml/cex" xmlns:w16cid="http://schemas.microsoft.com/office/word/2016/wordml/cid" xmlns:w16="http://schemas.microsoft.com/office/word/2018/wordml" xmlns:w16du="http://schemas.microsoft.com/office/word/2023/wordml/word16du" xmlns:w16sdtdh="http://schemas.microsoft.com/office/word/2020/wordml/sdtdatahash" xmlns:w16sdtfl="http://schemas.microsoft.com/office/word/2024/wordml/sdtformatlock" xmlns:w16se="http://schemas.microsoft.com/office/word/2015/wordml/symex" xmlns:wpg="http://schemas.microsoft.com/office/word/2010/wordprocessingGroup" xmlns:wpi="http://schemas.microsoft.com/office/word/2010/wordprocessingInk" xmlns:wne="http://schemas.microsoft.com/office/word/2006/wordml" xmlns:wps="http://schemas.microsoft.com/office/word/2010/wordprocessingShape" mc:Ignorable="w14 w15 w16se w16cid w16 w16cex w16sdtdh w16sdtfl w16du wp14">
-  <w:p>
-    <w:pPr>
-      <w:pStyle w:val="Kopfzeile"/>
       <w:jc w:val="right"/>
     </w:pPr>
     <w:r>
@@ -1802,7 +1811,7 @@
         <wp:inline distT="0" distB="0" distL="0" distR="0" wp14:anchorId="2CB0BCCB" wp14:editId="494793E7">
           <wp:extent cx="1828800" cy="771525"/>
           <wp:effectExtent l="0" t="0" r="0" b="9525"/>
-          <wp:docPr id="667649949" name="Grafik 1"/>
+          <wp:docPr id="1191259647" name="Grafik 1"/>
           <wp:cNvGraphicFramePr>
             <a:graphicFrameLocks xmlns:a="http://schemas.openxmlformats.org/drawingml/2006/main" noChangeAspect="1"/>
           </wp:cNvGraphicFramePr>
@@ -1843,16 +1852,6 @@
         </wp:inline>
       </w:drawing>
     </w:r>
-  </w:p>
-</w:hdr>
-</file>
-
-<file path=word/header3.xml><?xml version="1.0" encoding="utf-8"?>
-<w:hdr xmlns:wpc="http://schemas.microsoft.com/office/word/2010/wordprocessingCanvas" xmlns:cx="http://schemas.microsoft.com/office/drawing/2014/chartex" xmlns:cx1="http://schemas.microsoft.com/office/drawing/2015/9/8/chartex" xmlns:cx2="http://schemas.microsoft.com/office/drawing/2015/10/21/chartex" xmlns:cx3="http://schemas.microsoft.com/office/drawing/2016/5/9/chartex" xmlns:cx4="http://schemas.microsoft.com/office/drawing/2016/5/10/chartex" xmlns:cx5="http://schemas.microsoft.com/office/drawing/2016/5/11/chartex" xmlns:cx6="http://schemas.microsoft.com/office/drawing/2016/5/12/chartex" xmlns:cx7="http://schemas.microsoft.com/office/drawing/2016/5/13/chartex" xmlns:cx8="http://schemas.microsoft.com/office/drawing/2016/5/14/chartex" xmlns:mc="http://schemas.openxmlformats.org/markup-compatibility/2006" xmlns:aink="http://schemas.microsoft.com/office/drawing/2016/ink" xmlns:am3d="http://schemas.microsoft.com/office/drawing/2017/model3d" xmlns:o="urn:schemas-microsoft-com:office:office" xmlns:oel="http://schemas.microsoft.com/office/2019/extlst" xmlns:r="http://schemas.openxmlformats.org/officeDocument/2006/relationships" xmlns:m="http://schemas.openxmlformats.org/officeDocument/2006/math" xmlns:v="urn:schemas-microsoft-com:vml" xmlns:wp14="http://schemas.microsoft.com/office/word/2010/wordprocessingDrawing" xmlns:wp="http://schemas.openxmlformats.org/drawingml/2006/wordprocessingDrawing" xmlns:w10="urn:schemas-microsoft-com:office:word" xmlns:w="http://schemas.openxmlformats.org/wordprocessingml/2006/main" xmlns:w14="http://schemas.microsoft.com/office/word/2010/wordml" xmlns:w15="http://schemas.microsoft.com/office/word/2012/wordml" xmlns:w16cex="http://schemas.microsoft.com/office/word/2018/wordml/cex" xmlns:w16cid="http://schemas.microsoft.com/office/word/2016/wordml/cid" xmlns:w16="http://schemas.microsoft.com/office/word/2018/wordml" xmlns:w16du="http://schemas.microsoft.com/office/word/2023/wordml/word16du" xmlns:w16sdtdh="http://schemas.microsoft.com/office/word/2020/wordml/sdtdatahash" xmlns:w16sdtfl="http://schemas.microsoft.com/office/word/2024/wordml/sdtformatlock" xmlns:w16se="http://schemas.microsoft.com/office/word/2015/wordml/symex" xmlns:wpg="http://schemas.microsoft.com/office/word/2010/wordprocessingGroup" xmlns:wpi="http://schemas.microsoft.com/office/word/2010/wordprocessingInk" xmlns:wne="http://schemas.microsoft.com/office/word/2006/wordml" xmlns:wps="http://schemas.microsoft.com/office/word/2010/wordprocessingShape" mc:Ignorable="w14 w15 w16se w16cid w16 w16cex w16sdtdh w16sdtfl w16du wp14">
-  <w:p>
-    <w:pPr>
-      <w:pStyle w:val="Kopfzeile"/>
-    </w:pPr>
   </w:p>
 </w:hdr>
 </file>

</xml_diff>